<commit_message>
Open every brief with the main goal
- New first question on all four briefs: "What's the main goal here?"
  (pick one, required), with options to suit each package
- Goals section moved to the front; questions now follow section order
- The detailed goal question that follows is optional

Co-Authored-By: Claude Opus 5.5 <noreply@anthropic.com>
Claude-Session: https://claude.ai/code/session_01Ekm7mBGBy9a1vDE3KYrxvW
</commit_message>
<xml_diff>
--- a/dist/word/ASAP Marketing Brief.docx
+++ b/dist/word/ASAP Marketing Brief.docx
@@ -319,7 +319,7 @@
           <w:sz w:val="32"/>
           <w:szCs w:val="32"/>
         </w:rPr>
-        <w:t xml:space="preserve">Your Business</w:t>
+        <w:t xml:space="preserve">Your Goals</w:t>
       </w:r>
     </w:p>
     <w:p>
@@ -345,7 +345,7 @@
           <w:sz w:val="22"/>
           <w:szCs w:val="22"/>
         </w:rPr>
-        <w:t xml:space="preserve">Which package are you starting with?</w:t>
+        <w:t xml:space="preserve">What's the main goal here?</w:t>
       </w:r>
     </w:p>
     <w:p>
@@ -360,7 +360,25 @@
           <w:sz w:val="19"/>
           <w:szCs w:val="19"/>
         </w:rPr>
-        <w:t xml:space="preserve">This just tells us which questions matter for you.</w:t>
+        <w:t xml:space="preserve">Pick the one that matters most. Your strategy gets built around it.</w:t>
+      </w:r>
+    </w:p>
+    <w:p>
+      <w:pPr>
+        <w:keepNext/>
+        <w:spacing w:after="80" w:before="0"/>
+      </w:pPr>
+      <w:r>
+        <w:rPr>
+          <w:rFonts w:ascii="Arial" w:cs="Arial" w:eastAsia="Arial" w:hAnsi="Arial"/>
+          <w:b/>
+          <w:bCs/>
+          <w:caps/>
+          <w:spacing w:val="20"/>
+          <w:sz w:val="16"/>
+          <w:szCs w:val="16"/>
+        </w:rPr>
+        <w:t xml:space="preserve">We need this one to plan your content</w:t>
       </w:r>
     </w:p>
     <w:p>
@@ -389,7 +407,7 @@
           <w:sz w:val="21"/>
           <w:szCs w:val="21"/>
         </w:rPr>
-        <w:t xml:space="preserve">☐ Marketing Strategy</w:t>
+        <w:t xml:space="preserve">☐ More bookings or sales</w:t>
       </w:r>
       <w:r>
         <w:rPr>
@@ -397,7 +415,7 @@
           <w:sz w:val="21"/>
           <w:szCs w:val="21"/>
         </w:rPr>
-        <w:t xml:space="preserve">      ☐ ASAP Agency</w:t>
+        <w:t xml:space="preserve">      ☐ Fill quiet times</w:t>
       </w:r>
       <w:r>
         <w:rPr>
@@ -405,7 +423,7 @@
           <w:sz w:val="21"/>
           <w:szCs w:val="21"/>
         </w:rPr>
-        <w:t xml:space="preserve">      ☐ Custom Retainer</w:t>
+        <w:t xml:space="preserve">      ☐ Push a service or product</w:t>
       </w:r>
       <w:r>
         <w:rPr>
@@ -413,7 +431,39 @@
           <w:sz w:val="21"/>
           <w:szCs w:val="21"/>
         </w:rPr>
-        <w:t xml:space="preserve">      ☐ Not sure yet</w:t>
+        <w:t xml:space="preserve">      ☐ Launch something new</w:t>
+      </w:r>
+      <w:r>
+        <w:rPr>
+          <w:rFonts w:ascii="Arial" w:cs="Arial" w:eastAsia="Arial" w:hAnsi="Arial"/>
+          <w:sz w:val="21"/>
+          <w:szCs w:val="21"/>
+        </w:rPr>
+        <w:t xml:space="preserve">      ☐ Get known locally</w:t>
+      </w:r>
+      <w:r>
+        <w:rPr>
+          <w:rFonts w:ascii="Arial" w:cs="Arial" w:eastAsia="Arial" w:hAnsi="Arial"/>
+          <w:sz w:val="21"/>
+          <w:szCs w:val="21"/>
+        </w:rPr>
+        <w:t xml:space="preserve">      ☐ Grow into new areas</w:t>
+      </w:r>
+      <w:r>
+        <w:rPr>
+          <w:rFonts w:ascii="Arial" w:cs="Arial" w:eastAsia="Arial" w:hAnsi="Arial"/>
+          <w:sz w:val="21"/>
+          <w:szCs w:val="21"/>
+        </w:rPr>
+        <w:t xml:space="preserve">      ☐ Go more premium</w:t>
+      </w:r>
+      <w:r>
+        <w:rPr>
+          <w:rFonts w:ascii="Arial" w:cs="Arial" w:eastAsia="Arial" w:hAnsi="Arial"/>
+          <w:sz w:val="21"/>
+          <w:szCs w:val="21"/>
+        </w:rPr>
+        <w:t xml:space="preserve">      ☐ Hire staff</w:t>
       </w:r>
     </w:p>
     <w:p>
@@ -439,7 +489,7 @@
           <w:sz w:val="22"/>
           <w:szCs w:val="22"/>
         </w:rPr>
-        <w:t xml:space="preserve">What does your business do, in one sentence?</w:t>
+        <w:t xml:space="preserve">What do you want your marketing to do for you over the next 3 to 12 months?</w:t>
       </w:r>
     </w:p>
     <w:p>
@@ -454,7 +504,7 @@
           <w:sz w:val="19"/>
           <w:szCs w:val="19"/>
         </w:rPr>
-        <w:t xml:space="preserve">Like you'd explain it to a 12-year-old.</w:t>
+        <w:t xml:space="preserve">Be specific if you can: more of a certain service, fill quiet days, hire staff, launch something, open a second site.</w:t>
       </w:r>
     </w:p>
     <w:p>
@@ -471,7 +521,830 @@
           <w:sz w:val="18"/>
           <w:szCs w:val="18"/>
         </w:rPr>
-        <w:t xml:space="preserve">e.g. We fix sore backs and necks so people can get back to work and sport.</w:t>
+        <w:t xml:space="preserve">e.g. Fill our Tuesday and Wednesday afternoons, and get more people booking pregnancy massage.</w:t>
+      </w:r>
+    </w:p>
+    <w:tbl>
+      <w:tblPr>
+        <w:tblW w:type="dxa" w:w="9638"/>
+        <w:tblBorders>
+          <w:top w:val="single" w:color="auto" w:sz="4"/>
+          <w:left w:val="single" w:color="auto" w:sz="4"/>
+          <w:bottom w:val="single" w:color="auto" w:sz="4"/>
+          <w:right w:val="single" w:color="auto" w:sz="4"/>
+          <w:insideH w:val="single" w:color="auto" w:sz="4"/>
+          <w:insideV w:val="single" w:color="auto" w:sz="4"/>
+        </w:tblBorders>
+      </w:tblPr>
+      <w:tblGrid>
+        <w:gridCol w:w="9638"/>
+      </w:tblGrid>
+      <w:tr>
+        <w:trPr>
+          <w:cantSplit/>
+          <w:trHeight w:val="1300" w:hRule="atLeast"/>
+        </w:trPr>
+        <w:tc>
+          <w:tcPr>
+            <w:tcW w:type="dxa" w:w="9638"/>
+            <w:tcBorders>
+              <w:top w:val="single" w:color="BFBFBF" w:sz="4"/>
+              <w:left w:val="single" w:color="BFBFBF" w:sz="4"/>
+              <w:bottom w:val="single" w:color="BFBFBF" w:sz="4"/>
+              <w:right w:val="single" w:color="BFBFBF" w:sz="4"/>
+            </w:tcBorders>
+            <w:tcMar>
+              <w:top w:type="dxa" w:w="80"/>
+              <w:left w:type="dxa" w:w="120"/>
+              <w:bottom w:type="dxa" w:w="80"/>
+              <w:right w:type="dxa" w:w="120"/>
+            </w:tcMar>
+          </w:tcPr>
+          <w:p>
+            <w:pPr>
+              <w:spacing w:after="0" w:before="0"/>
+            </w:pPr>
+            <w:r>
+              <w:rPr>
+                <w:rFonts w:ascii="Arial" w:cs="Arial" w:eastAsia="Arial" w:hAnsi="Arial"/>
+                <w:sz w:val="21"/>
+                <w:szCs w:val="21"/>
+              </w:rPr>
+              <w:t xml:space="preserve"/>
+            </w:r>
+          </w:p>
+        </w:tc>
+      </w:tr>
+    </w:tbl>
+    <w:p>
+      <w:pPr>
+        <w:keepNext/>
+        <w:spacing w:after="60" w:before="280"/>
+      </w:pPr>
+      <w:r>
+        <w:rPr>
+          <w:rFonts w:ascii="Arial" w:cs="Arial" w:eastAsia="Arial" w:hAnsi="Arial"/>
+          <w:b/>
+          <w:bCs/>
+          <w:sz w:val="22"/>
+          <w:szCs w:val="22"/>
+        </w:rPr>
+        <w:t xml:space="preserve">3.  </w:t>
+      </w:r>
+      <w:r>
+        <w:rPr>
+          <w:rFonts w:ascii="Arial" w:cs="Arial" w:eastAsia="Arial" w:hAnsi="Arial"/>
+          <w:b/>
+          <w:bCs/>
+          <w:sz w:val="22"/>
+          <w:szCs w:val="22"/>
+        </w:rPr>
+        <w:t xml:space="preserve">How will we know it's working?</w:t>
+      </w:r>
+    </w:p>
+    <w:p>
+      <w:pPr>
+        <w:keepNext/>
+        <w:spacing w:after="80" w:before="0"/>
+      </w:pPr>
+      <w:r>
+        <w:rPr>
+          <w:rFonts w:ascii="Arial" w:cs="Arial" w:eastAsia="Arial" w:hAnsi="Arial"/>
+          <w:color w:val="6F6F6F"/>
+          <w:sz w:val="19"/>
+          <w:szCs w:val="19"/>
+        </w:rPr>
+        <w:t xml:space="preserve">Rough numbers are perfect. Knowing where you're starting lets us show you what's moved.</w:t>
+      </w:r>
+    </w:p>
+    <w:tbl>
+      <w:tblPr>
+        <w:tblW w:type="dxa" w:w="9638"/>
+        <w:tblBorders>
+          <w:top w:val="single" w:color="auto" w:sz="4"/>
+          <w:left w:val="single" w:color="auto" w:sz="4"/>
+          <w:bottom w:val="single" w:color="auto" w:sz="4"/>
+          <w:right w:val="single" w:color="auto" w:sz="4"/>
+          <w:insideH w:val="single" w:color="auto" w:sz="4"/>
+          <w:insideV w:val="single" w:color="auto" w:sz="4"/>
+        </w:tblBorders>
+      </w:tblPr>
+      <w:tblGrid>
+        <w:gridCol w:w="3470"/>
+        <w:gridCol w:w="6168"/>
+      </w:tblGrid>
+      <w:tr>
+        <w:trPr>
+          <w:cantSplit/>
+          <w:trHeight w:val="520" w:hRule="atLeast"/>
+        </w:trPr>
+        <w:tc>
+          <w:tcPr>
+            <w:tcW w:type="dxa" w:w="3470"/>
+            <w:tcBorders>
+              <w:top w:val="single" w:color="BFBFBF" w:sz="4"/>
+              <w:left w:val="single" w:color="BFBFBF" w:sz="4"/>
+              <w:bottom w:val="single" w:color="BFBFBF" w:sz="4"/>
+              <w:right w:val="single" w:color="BFBFBF" w:sz="4"/>
+            </w:tcBorders>
+            <w:shd w:fill="F2F2F2" w:color="auto" w:val="clear"/>
+            <w:tcMar>
+              <w:top w:type="dxa" w:w="80"/>
+              <w:left w:type="dxa" w:w="120"/>
+              <w:bottom w:type="dxa" w:w="80"/>
+              <w:right w:type="dxa" w:w="120"/>
+            </w:tcMar>
+          </w:tcPr>
+          <w:p>
+            <w:pPr>
+              <w:spacing w:after="0" w:before="0"/>
+            </w:pPr>
+            <w:r>
+              <w:rPr>
+                <w:rFonts w:ascii="Arial" w:cs="Arial" w:eastAsia="Arial" w:hAnsi="Arial"/>
+                <w:color w:val="6F6F6F"/>
+                <w:sz w:val="18"/>
+                <w:szCs w:val="18"/>
+              </w:rPr>
+              <w:t xml:space="preserve">What a win looks like in 3 months</w:t>
+            </w:r>
+          </w:p>
+        </w:tc>
+        <w:tc>
+          <w:tcPr>
+            <w:tcW w:type="dxa" w:w="6168"/>
+            <w:tcBorders>
+              <w:top w:val="single" w:color="BFBFBF" w:sz="4"/>
+              <w:left w:val="single" w:color="BFBFBF" w:sz="4"/>
+              <w:bottom w:val="single" w:color="BFBFBF" w:sz="4"/>
+              <w:right w:val="single" w:color="BFBFBF" w:sz="4"/>
+            </w:tcBorders>
+            <w:tcMar>
+              <w:top w:type="dxa" w:w="80"/>
+              <w:left w:type="dxa" w:w="120"/>
+              <w:bottom w:type="dxa" w:w="80"/>
+              <w:right w:type="dxa" w:w="120"/>
+            </w:tcMar>
+          </w:tcPr>
+          <w:p>
+            <w:pPr>
+              <w:spacing w:after="0" w:before="0"/>
+            </w:pPr>
+            <w:r>
+              <w:rPr>
+                <w:rFonts w:ascii="Arial" w:cs="Arial" w:eastAsia="Arial" w:hAnsi="Arial"/>
+                <w:sz w:val="21"/>
+                <w:szCs w:val="21"/>
+              </w:rPr>
+              <w:t xml:space="preserve"/>
+            </w:r>
+          </w:p>
+        </w:tc>
+      </w:tr>
+      <w:tr>
+        <w:trPr>
+          <w:cantSplit/>
+          <w:trHeight w:val="520" w:hRule="atLeast"/>
+        </w:trPr>
+        <w:tc>
+          <w:tcPr>
+            <w:tcW w:type="dxa" w:w="3470"/>
+            <w:tcBorders>
+              <w:top w:val="single" w:color="BFBFBF" w:sz="4"/>
+              <w:left w:val="single" w:color="BFBFBF" w:sz="4"/>
+              <w:bottom w:val="single" w:color="BFBFBF" w:sz="4"/>
+              <w:right w:val="single" w:color="BFBFBF" w:sz="4"/>
+            </w:tcBorders>
+            <w:shd w:fill="F2F2F2" w:color="auto" w:val="clear"/>
+            <w:tcMar>
+              <w:top w:type="dxa" w:w="80"/>
+              <w:left w:type="dxa" w:w="120"/>
+              <w:bottom w:type="dxa" w:w="80"/>
+              <w:right w:type="dxa" w:w="120"/>
+            </w:tcMar>
+          </w:tcPr>
+          <w:p>
+            <w:pPr>
+              <w:spacing w:after="0" w:before="0"/>
+            </w:pPr>
+            <w:r>
+              <w:rPr>
+                <w:rFonts w:ascii="Arial" w:cs="Arial" w:eastAsia="Arial" w:hAnsi="Arial"/>
+                <w:color w:val="6F6F6F"/>
+                <w:sz w:val="18"/>
+                <w:szCs w:val="18"/>
+              </w:rPr>
+              <w:t xml:space="preserve">How you'll measure it</w:t>
+            </w:r>
+          </w:p>
+        </w:tc>
+        <w:tc>
+          <w:tcPr>
+            <w:tcW w:type="dxa" w:w="6168"/>
+            <w:tcBorders>
+              <w:top w:val="single" w:color="BFBFBF" w:sz="4"/>
+              <w:left w:val="single" w:color="BFBFBF" w:sz="4"/>
+              <w:bottom w:val="single" w:color="BFBFBF" w:sz="4"/>
+              <w:right w:val="single" w:color="BFBFBF" w:sz="4"/>
+            </w:tcBorders>
+            <w:tcMar>
+              <w:top w:type="dxa" w:w="80"/>
+              <w:left w:type="dxa" w:w="120"/>
+              <w:bottom w:type="dxa" w:w="80"/>
+              <w:right w:type="dxa" w:w="120"/>
+            </w:tcMar>
+          </w:tcPr>
+          <w:p>
+            <w:pPr>
+              <w:spacing w:after="0" w:before="0"/>
+            </w:pPr>
+            <w:r>
+              <w:rPr>
+                <w:rFonts w:ascii="Arial" w:cs="Arial" w:eastAsia="Arial" w:hAnsi="Arial"/>
+                <w:sz w:val="21"/>
+                <w:szCs w:val="21"/>
+              </w:rPr>
+              <w:t xml:space="preserve"/>
+            </w:r>
+          </w:p>
+        </w:tc>
+      </w:tr>
+      <w:tr>
+        <w:trPr>
+          <w:cantSplit/>
+          <w:trHeight w:val="520" w:hRule="atLeast"/>
+        </w:trPr>
+        <w:tc>
+          <w:tcPr>
+            <w:tcW w:type="dxa" w:w="3470"/>
+            <w:tcBorders>
+              <w:top w:val="single" w:color="BFBFBF" w:sz="4"/>
+              <w:left w:val="single" w:color="BFBFBF" w:sz="4"/>
+              <w:bottom w:val="single" w:color="BFBFBF" w:sz="4"/>
+              <w:right w:val="single" w:color="BFBFBF" w:sz="4"/>
+            </w:tcBorders>
+            <w:shd w:fill="F2F2F2" w:color="auto" w:val="clear"/>
+            <w:tcMar>
+              <w:top w:type="dxa" w:w="80"/>
+              <w:left w:type="dxa" w:w="120"/>
+              <w:bottom w:type="dxa" w:w="80"/>
+              <w:right w:type="dxa" w:w="120"/>
+            </w:tcMar>
+          </w:tcPr>
+          <w:p>
+            <w:pPr>
+              <w:spacing w:after="0" w:before="0"/>
+            </w:pPr>
+            <w:r>
+              <w:rPr>
+                <w:rFonts w:ascii="Arial" w:cs="Arial" w:eastAsia="Arial" w:hAnsi="Arial"/>
+                <w:color w:val="6F6F6F"/>
+                <w:sz w:val="18"/>
+                <w:szCs w:val="18"/>
+              </w:rPr>
+              <w:t xml:space="preserve">Where that's at today</w:t>
+            </w:r>
+          </w:p>
+        </w:tc>
+        <w:tc>
+          <w:tcPr>
+            <w:tcW w:type="dxa" w:w="6168"/>
+            <w:tcBorders>
+              <w:top w:val="single" w:color="BFBFBF" w:sz="4"/>
+              <w:left w:val="single" w:color="BFBFBF" w:sz="4"/>
+              <w:bottom w:val="single" w:color="BFBFBF" w:sz="4"/>
+              <w:right w:val="single" w:color="BFBFBF" w:sz="4"/>
+            </w:tcBorders>
+            <w:tcMar>
+              <w:top w:type="dxa" w:w="80"/>
+              <w:left w:type="dxa" w:w="120"/>
+              <w:bottom w:type="dxa" w:w="80"/>
+              <w:right w:type="dxa" w:w="120"/>
+            </w:tcMar>
+          </w:tcPr>
+          <w:p>
+            <w:pPr>
+              <w:spacing w:after="0" w:before="0"/>
+            </w:pPr>
+            <w:r>
+              <w:rPr>
+                <w:rFonts w:ascii="Arial" w:cs="Arial" w:eastAsia="Arial" w:hAnsi="Arial"/>
+                <w:sz w:val="21"/>
+                <w:szCs w:val="21"/>
+              </w:rPr>
+              <w:t xml:space="preserve"/>
+            </w:r>
+          </w:p>
+        </w:tc>
+      </w:tr>
+    </w:tbl>
+    <w:p>
+      <w:pPr>
+        <w:keepNext/>
+        <w:spacing w:after="60" w:before="280"/>
+      </w:pPr>
+      <w:r>
+        <w:rPr>
+          <w:rFonts w:ascii="Arial" w:cs="Arial" w:eastAsia="Arial" w:hAnsi="Arial"/>
+          <w:b/>
+          <w:bCs/>
+          <w:sz w:val="22"/>
+          <w:szCs w:val="22"/>
+        </w:rPr>
+        <w:t xml:space="preserve">4.  </w:t>
+      </w:r>
+      <w:r>
+        <w:rPr>
+          <w:rFonts w:ascii="Arial" w:cs="Arial" w:eastAsia="Arial" w:hAnsi="Arial"/>
+          <w:b/>
+          <w:bCs/>
+          <w:sz w:val="22"/>
+          <w:szCs w:val="22"/>
+        </w:rPr>
+        <w:t xml:space="preserve">What are your numbers right now?</w:t>
+      </w:r>
+    </w:p>
+    <w:p>
+      <w:pPr>
+        <w:keepNext/>
+        <w:spacing w:after="80" w:before="0"/>
+      </w:pPr>
+      <w:r>
+        <w:rPr>
+          <w:rFonts w:ascii="Arial" w:cs="Arial" w:eastAsia="Arial" w:hAnsi="Arial"/>
+          <w:color w:val="6F6F6F"/>
+          <w:sz w:val="19"/>
+          <w:szCs w:val="19"/>
+        </w:rPr>
+        <w:t xml:space="preserve">Rough is fine. These turn your strategy from a guess into a plan. Skip any you don't know.</w:t>
+      </w:r>
+    </w:p>
+    <w:tbl>
+      <w:tblPr>
+        <w:tblW w:type="dxa" w:w="9638"/>
+        <w:tblBorders>
+          <w:top w:val="single" w:color="auto" w:sz="4"/>
+          <w:left w:val="single" w:color="auto" w:sz="4"/>
+          <w:bottom w:val="single" w:color="auto" w:sz="4"/>
+          <w:right w:val="single" w:color="auto" w:sz="4"/>
+          <w:insideH w:val="single" w:color="auto" w:sz="4"/>
+          <w:insideV w:val="single" w:color="auto" w:sz="4"/>
+        </w:tblBorders>
+      </w:tblPr>
+      <w:tblGrid>
+        <w:gridCol w:w="3470"/>
+        <w:gridCol w:w="6168"/>
+      </w:tblGrid>
+      <w:tr>
+        <w:trPr>
+          <w:cantSplit/>
+          <w:trHeight w:val="520" w:hRule="atLeast"/>
+        </w:trPr>
+        <w:tc>
+          <w:tcPr>
+            <w:tcW w:type="dxa" w:w="3470"/>
+            <w:tcBorders>
+              <w:top w:val="single" w:color="BFBFBF" w:sz="4"/>
+              <w:left w:val="single" w:color="BFBFBF" w:sz="4"/>
+              <w:bottom w:val="single" w:color="BFBFBF" w:sz="4"/>
+              <w:right w:val="single" w:color="BFBFBF" w:sz="4"/>
+            </w:tcBorders>
+            <w:shd w:fill="F2F2F2" w:color="auto" w:val="clear"/>
+            <w:tcMar>
+              <w:top w:type="dxa" w:w="80"/>
+              <w:left w:type="dxa" w:w="120"/>
+              <w:bottom w:type="dxa" w:w="80"/>
+              <w:right w:type="dxa" w:w="120"/>
+            </w:tcMar>
+          </w:tcPr>
+          <w:p>
+            <w:pPr>
+              <w:spacing w:after="0" w:before="0"/>
+            </w:pPr>
+            <w:r>
+              <w:rPr>
+                <w:rFonts w:ascii="Arial" w:cs="Arial" w:eastAsia="Arial" w:hAnsi="Arial"/>
+                <w:color w:val="6F6F6F"/>
+                <w:sz w:val="18"/>
+                <w:szCs w:val="18"/>
+              </w:rPr>
+              <w:t xml:space="preserve">Enquiries or bookings a month</w:t>
+            </w:r>
+          </w:p>
+        </w:tc>
+        <w:tc>
+          <w:tcPr>
+            <w:tcW w:type="dxa" w:w="6168"/>
+            <w:tcBorders>
+              <w:top w:val="single" w:color="BFBFBF" w:sz="4"/>
+              <w:left w:val="single" w:color="BFBFBF" w:sz="4"/>
+              <w:bottom w:val="single" w:color="BFBFBF" w:sz="4"/>
+              <w:right w:val="single" w:color="BFBFBF" w:sz="4"/>
+            </w:tcBorders>
+            <w:tcMar>
+              <w:top w:type="dxa" w:w="80"/>
+              <w:left w:type="dxa" w:w="120"/>
+              <w:bottom w:type="dxa" w:w="80"/>
+              <w:right w:type="dxa" w:w="120"/>
+            </w:tcMar>
+          </w:tcPr>
+          <w:p>
+            <w:pPr>
+              <w:spacing w:after="0" w:before="0"/>
+            </w:pPr>
+            <w:r>
+              <w:rPr>
+                <w:rFonts w:ascii="Arial" w:cs="Arial" w:eastAsia="Arial" w:hAnsi="Arial"/>
+                <w:sz w:val="21"/>
+                <w:szCs w:val="21"/>
+              </w:rPr>
+              <w:t xml:space="preserve"/>
+            </w:r>
+          </w:p>
+        </w:tc>
+      </w:tr>
+      <w:tr>
+        <w:trPr>
+          <w:cantSplit/>
+          <w:trHeight w:val="520" w:hRule="atLeast"/>
+        </w:trPr>
+        <w:tc>
+          <w:tcPr>
+            <w:tcW w:type="dxa" w:w="3470"/>
+            <w:tcBorders>
+              <w:top w:val="single" w:color="BFBFBF" w:sz="4"/>
+              <w:left w:val="single" w:color="BFBFBF" w:sz="4"/>
+              <w:bottom w:val="single" w:color="BFBFBF" w:sz="4"/>
+              <w:right w:val="single" w:color="BFBFBF" w:sz="4"/>
+            </w:tcBorders>
+            <w:shd w:fill="F2F2F2" w:color="auto" w:val="clear"/>
+            <w:tcMar>
+              <w:top w:type="dxa" w:w="80"/>
+              <w:left w:type="dxa" w:w="120"/>
+              <w:bottom w:type="dxa" w:w="80"/>
+              <w:right w:type="dxa" w:w="120"/>
+            </w:tcMar>
+          </w:tcPr>
+          <w:p>
+            <w:pPr>
+              <w:spacing w:after="0" w:before="0"/>
+            </w:pPr>
+            <w:r>
+              <w:rPr>
+                <w:rFonts w:ascii="Arial" w:cs="Arial" w:eastAsia="Arial" w:hAnsi="Arial"/>
+                <w:color w:val="6F6F6F"/>
+                <w:sz w:val="18"/>
+                <w:szCs w:val="18"/>
+              </w:rPr>
+              <w:t xml:space="preserve">How many more customers you could take</w:t>
+            </w:r>
+          </w:p>
+        </w:tc>
+        <w:tc>
+          <w:tcPr>
+            <w:tcW w:type="dxa" w:w="6168"/>
+            <w:tcBorders>
+              <w:top w:val="single" w:color="BFBFBF" w:sz="4"/>
+              <w:left w:val="single" w:color="BFBFBF" w:sz="4"/>
+              <w:bottom w:val="single" w:color="BFBFBF" w:sz="4"/>
+              <w:right w:val="single" w:color="BFBFBF" w:sz="4"/>
+            </w:tcBorders>
+            <w:tcMar>
+              <w:top w:type="dxa" w:w="80"/>
+              <w:left w:type="dxa" w:w="120"/>
+              <w:bottom w:type="dxa" w:w="80"/>
+              <w:right w:type="dxa" w:w="120"/>
+            </w:tcMar>
+          </w:tcPr>
+          <w:p>
+            <w:pPr>
+              <w:spacing w:after="0" w:before="0"/>
+            </w:pPr>
+            <w:r>
+              <w:rPr>
+                <w:rFonts w:ascii="Arial" w:cs="Arial" w:eastAsia="Arial" w:hAnsi="Arial"/>
+                <w:sz w:val="21"/>
+                <w:szCs w:val="21"/>
+              </w:rPr>
+              <w:t xml:space="preserve"/>
+            </w:r>
+          </w:p>
+        </w:tc>
+      </w:tr>
+      <w:tr>
+        <w:trPr>
+          <w:cantSplit/>
+          <w:trHeight w:val="520" w:hRule="atLeast"/>
+        </w:trPr>
+        <w:tc>
+          <w:tcPr>
+            <w:tcW w:type="dxa" w:w="3470"/>
+            <w:tcBorders>
+              <w:top w:val="single" w:color="BFBFBF" w:sz="4"/>
+              <w:left w:val="single" w:color="BFBFBF" w:sz="4"/>
+              <w:bottom w:val="single" w:color="BFBFBF" w:sz="4"/>
+              <w:right w:val="single" w:color="BFBFBF" w:sz="4"/>
+            </w:tcBorders>
+            <w:shd w:fill="F2F2F2" w:color="auto" w:val="clear"/>
+            <w:tcMar>
+              <w:top w:type="dxa" w:w="80"/>
+              <w:left w:type="dxa" w:w="120"/>
+              <w:bottom w:type="dxa" w:w="80"/>
+              <w:right w:type="dxa" w:w="120"/>
+            </w:tcMar>
+          </w:tcPr>
+          <w:p>
+            <w:pPr>
+              <w:spacing w:after="0" w:before="0"/>
+            </w:pPr>
+            <w:r>
+              <w:rPr>
+                <w:rFonts w:ascii="Arial" w:cs="Arial" w:eastAsia="Arial" w:hAnsi="Arial"/>
+                <w:color w:val="6F6F6F"/>
+                <w:sz w:val="18"/>
+                <w:szCs w:val="18"/>
+              </w:rPr>
+              <w:t xml:space="preserve">Your most profitable service or product</w:t>
+            </w:r>
+          </w:p>
+        </w:tc>
+        <w:tc>
+          <w:tcPr>
+            <w:tcW w:type="dxa" w:w="6168"/>
+            <w:tcBorders>
+              <w:top w:val="single" w:color="BFBFBF" w:sz="4"/>
+              <w:left w:val="single" w:color="BFBFBF" w:sz="4"/>
+              <w:bottom w:val="single" w:color="BFBFBF" w:sz="4"/>
+              <w:right w:val="single" w:color="BFBFBF" w:sz="4"/>
+            </w:tcBorders>
+            <w:tcMar>
+              <w:top w:type="dxa" w:w="80"/>
+              <w:left w:type="dxa" w:w="120"/>
+              <w:bottom w:type="dxa" w:w="80"/>
+              <w:right w:type="dxa" w:w="120"/>
+            </w:tcMar>
+          </w:tcPr>
+          <w:p>
+            <w:pPr>
+              <w:spacing w:after="0" w:before="0"/>
+            </w:pPr>
+            <w:r>
+              <w:rPr>
+                <w:rFonts w:ascii="Arial" w:cs="Arial" w:eastAsia="Arial" w:hAnsi="Arial"/>
+                <w:sz w:val="21"/>
+                <w:szCs w:val="21"/>
+              </w:rPr>
+              <w:t xml:space="preserve"/>
+            </w:r>
+          </w:p>
+        </w:tc>
+      </w:tr>
+      <w:tr>
+        <w:trPr>
+          <w:cantSplit/>
+          <w:trHeight w:val="520" w:hRule="atLeast"/>
+        </w:trPr>
+        <w:tc>
+          <w:tcPr>
+            <w:tcW w:type="dxa" w:w="3470"/>
+            <w:tcBorders>
+              <w:top w:val="single" w:color="BFBFBF" w:sz="4"/>
+              <w:left w:val="single" w:color="BFBFBF" w:sz="4"/>
+              <w:bottom w:val="single" w:color="BFBFBF" w:sz="4"/>
+              <w:right w:val="single" w:color="BFBFBF" w:sz="4"/>
+            </w:tcBorders>
+            <w:shd w:fill="F2F2F2" w:color="auto" w:val="clear"/>
+            <w:tcMar>
+              <w:top w:type="dxa" w:w="80"/>
+              <w:left w:type="dxa" w:w="120"/>
+              <w:bottom w:type="dxa" w:w="80"/>
+              <w:right w:type="dxa" w:w="120"/>
+            </w:tcMar>
+          </w:tcPr>
+          <w:p>
+            <w:pPr>
+              <w:spacing w:after="0" w:before="0"/>
+            </w:pPr>
+            <w:r>
+              <w:rPr>
+                <w:rFonts w:ascii="Arial" w:cs="Arial" w:eastAsia="Arial" w:hAnsi="Arial"/>
+                <w:color w:val="6F6F6F"/>
+                <w:sz w:val="18"/>
+                <w:szCs w:val="18"/>
+              </w:rPr>
+              <w:t xml:space="preserve">Google rating and number of reviews</w:t>
+            </w:r>
+          </w:p>
+        </w:tc>
+        <w:tc>
+          <w:tcPr>
+            <w:tcW w:type="dxa" w:w="6168"/>
+            <w:tcBorders>
+              <w:top w:val="single" w:color="BFBFBF" w:sz="4"/>
+              <w:left w:val="single" w:color="BFBFBF" w:sz="4"/>
+              <w:bottom w:val="single" w:color="BFBFBF" w:sz="4"/>
+              <w:right w:val="single" w:color="BFBFBF" w:sz="4"/>
+            </w:tcBorders>
+            <w:tcMar>
+              <w:top w:type="dxa" w:w="80"/>
+              <w:left w:type="dxa" w:w="120"/>
+              <w:bottom w:type="dxa" w:w="80"/>
+              <w:right w:type="dxa" w:w="120"/>
+            </w:tcMar>
+          </w:tcPr>
+          <w:p>
+            <w:pPr>
+              <w:spacing w:after="0" w:before="0"/>
+            </w:pPr>
+            <w:r>
+              <w:rPr>
+                <w:rFonts w:ascii="Arial" w:cs="Arial" w:eastAsia="Arial" w:hAnsi="Arial"/>
+                <w:sz w:val="21"/>
+                <w:szCs w:val="21"/>
+              </w:rPr>
+              <w:t xml:space="preserve"/>
+            </w:r>
+          </w:p>
+        </w:tc>
+      </w:tr>
+      <w:tr>
+        <w:trPr>
+          <w:cantSplit/>
+          <w:trHeight w:val="520" w:hRule="atLeast"/>
+        </w:trPr>
+        <w:tc>
+          <w:tcPr>
+            <w:tcW w:type="dxa" w:w="3470"/>
+            <w:tcBorders>
+              <w:top w:val="single" w:color="BFBFBF" w:sz="4"/>
+              <w:left w:val="single" w:color="BFBFBF" w:sz="4"/>
+              <w:bottom w:val="single" w:color="BFBFBF" w:sz="4"/>
+              <w:right w:val="single" w:color="BFBFBF" w:sz="4"/>
+            </w:tcBorders>
+            <w:shd w:fill="F2F2F2" w:color="auto" w:val="clear"/>
+            <w:tcMar>
+              <w:top w:type="dxa" w:w="80"/>
+              <w:left w:type="dxa" w:w="120"/>
+              <w:bottom w:type="dxa" w:w="80"/>
+              <w:right w:type="dxa" w:w="120"/>
+            </w:tcMar>
+          </w:tcPr>
+          <w:p>
+            <w:pPr>
+              <w:spacing w:after="0" w:before="0"/>
+            </w:pPr>
+            <w:r>
+              <w:rPr>
+                <w:rFonts w:ascii="Arial" w:cs="Arial" w:eastAsia="Arial" w:hAnsi="Arial"/>
+                <w:color w:val="6F6F6F"/>
+                <w:sz w:val="18"/>
+                <w:szCs w:val="18"/>
+              </w:rPr>
+              <w:t xml:space="preserve">Followers on your main account</w:t>
+            </w:r>
+          </w:p>
+        </w:tc>
+        <w:tc>
+          <w:tcPr>
+            <w:tcW w:type="dxa" w:w="6168"/>
+            <w:tcBorders>
+              <w:top w:val="single" w:color="BFBFBF" w:sz="4"/>
+              <w:left w:val="single" w:color="BFBFBF" w:sz="4"/>
+              <w:bottom w:val="single" w:color="BFBFBF" w:sz="4"/>
+              <w:right w:val="single" w:color="BFBFBF" w:sz="4"/>
+            </w:tcBorders>
+            <w:tcMar>
+              <w:top w:type="dxa" w:w="80"/>
+              <w:left w:type="dxa" w:w="120"/>
+              <w:bottom w:type="dxa" w:w="80"/>
+              <w:right w:type="dxa" w:w="120"/>
+            </w:tcMar>
+          </w:tcPr>
+          <w:p>
+            <w:pPr>
+              <w:spacing w:after="0" w:before="0"/>
+            </w:pPr>
+            <w:r>
+              <w:rPr>
+                <w:rFonts w:ascii="Arial" w:cs="Arial" w:eastAsia="Arial" w:hAnsi="Arial"/>
+                <w:sz w:val="21"/>
+                <w:szCs w:val="21"/>
+              </w:rPr>
+              <w:t xml:space="preserve"/>
+            </w:r>
+          </w:p>
+        </w:tc>
+      </w:tr>
+      <w:tr>
+        <w:trPr>
+          <w:cantSplit/>
+          <w:trHeight w:val="520" w:hRule="atLeast"/>
+        </w:trPr>
+        <w:tc>
+          <w:tcPr>
+            <w:tcW w:type="dxa" w:w="3470"/>
+            <w:tcBorders>
+              <w:top w:val="single" w:color="BFBFBF" w:sz="4"/>
+              <w:left w:val="single" w:color="BFBFBF" w:sz="4"/>
+              <w:bottom w:val="single" w:color="BFBFBF" w:sz="4"/>
+              <w:right w:val="single" w:color="BFBFBF" w:sz="4"/>
+            </w:tcBorders>
+            <w:shd w:fill="F2F2F2" w:color="auto" w:val="clear"/>
+            <w:tcMar>
+              <w:top w:type="dxa" w:w="80"/>
+              <w:left w:type="dxa" w:w="120"/>
+              <w:bottom w:type="dxa" w:w="80"/>
+              <w:right w:type="dxa" w:w="120"/>
+            </w:tcMar>
+          </w:tcPr>
+          <w:p>
+            <w:pPr>
+              <w:spacing w:after="0" w:before="0"/>
+            </w:pPr>
+            <w:r>
+              <w:rPr>
+                <w:rFonts w:ascii="Arial" w:cs="Arial" w:eastAsia="Arial" w:hAnsi="Arial"/>
+                <w:color w:val="6F6F6F"/>
+                <w:sz w:val="18"/>
+                <w:szCs w:val="18"/>
+              </w:rPr>
+              <w:t xml:space="preserve">Monthly ad spend, if any</w:t>
+            </w:r>
+          </w:p>
+        </w:tc>
+        <w:tc>
+          <w:tcPr>
+            <w:tcW w:type="dxa" w:w="6168"/>
+            <w:tcBorders>
+              <w:top w:val="single" w:color="BFBFBF" w:sz="4"/>
+              <w:left w:val="single" w:color="BFBFBF" w:sz="4"/>
+              <w:bottom w:val="single" w:color="BFBFBF" w:sz="4"/>
+              <w:right w:val="single" w:color="BFBFBF" w:sz="4"/>
+            </w:tcBorders>
+            <w:tcMar>
+              <w:top w:type="dxa" w:w="80"/>
+              <w:left w:type="dxa" w:w="120"/>
+              <w:bottom w:type="dxa" w:w="80"/>
+              <w:right w:type="dxa" w:w="120"/>
+            </w:tcMar>
+          </w:tcPr>
+          <w:p>
+            <w:pPr>
+              <w:spacing w:after="0" w:before="0"/>
+            </w:pPr>
+            <w:r>
+              <w:rPr>
+                <w:rFonts w:ascii="Arial" w:cs="Arial" w:eastAsia="Arial" w:hAnsi="Arial"/>
+                <w:sz w:val="21"/>
+                <w:szCs w:val="21"/>
+              </w:rPr>
+              <w:t xml:space="preserve"/>
+            </w:r>
+          </w:p>
+        </w:tc>
+      </w:tr>
+    </w:tbl>
+    <w:p>
+      <w:pPr>
+        <w:keepNext/>
+        <w:spacing w:after="60" w:before="280"/>
+      </w:pPr>
+      <w:r>
+        <w:rPr>
+          <w:rFonts w:ascii="Arial" w:cs="Arial" w:eastAsia="Arial" w:hAnsi="Arial"/>
+          <w:b/>
+          <w:bCs/>
+          <w:sz w:val="22"/>
+          <w:szCs w:val="22"/>
+        </w:rPr>
+        <w:t xml:space="preserve">5.  </w:t>
+      </w:r>
+      <w:r>
+        <w:rPr>
+          <w:rFonts w:ascii="Arial" w:cs="Arial" w:eastAsia="Arial" w:hAnsi="Arial"/>
+          <w:b/>
+          <w:bCs/>
+          <w:sz w:val="22"/>
+          <w:szCs w:val="22"/>
+        </w:rPr>
+        <w:t xml:space="preserve">What's the biggest thing holding your marketing back right now?</w:t>
+      </w:r>
+    </w:p>
+    <w:p>
+      <w:pPr>
+        <w:keepNext/>
+        <w:spacing w:after="80" w:before="0"/>
+      </w:pPr>
+      <w:r>
+        <w:rPr>
+          <w:rFonts w:ascii="Arial" w:cs="Arial" w:eastAsia="Arial" w:hAnsi="Arial"/>
+          <w:i/>
+          <w:iCs/>
+          <w:color w:val="9A9A9A"/>
+          <w:sz w:val="18"/>
+          <w:szCs w:val="18"/>
+        </w:rPr>
+        <w:t xml:space="preserve">e.g. Time. We post in bursts, then disappear for a month.</w:t>
       </w:r>
     </w:p>
     <w:tbl>
@@ -594,6 +1467,556 @@
                 <w:sz w:val="18"/>
                 <w:szCs w:val="18"/>
               </w:rPr>
+              <w:t xml:space="preserve">What have you tried before that didn't work, and why do you think it didn't?</w:t>
+            </w:r>
+          </w:p>
+        </w:tc>
+        <w:tc>
+          <w:tcPr>
+            <w:tcW w:type="dxa" w:w="6168"/>
+            <w:tcBorders>
+              <w:top w:val="single" w:color="BFBFBF" w:sz="4"/>
+              <w:left w:val="single" w:color="BFBFBF" w:sz="4"/>
+              <w:bottom w:val="single" w:color="BFBFBF" w:sz="4"/>
+              <w:right w:val="single" w:color="BFBFBF" w:sz="4"/>
+            </w:tcBorders>
+            <w:tcMar>
+              <w:top w:type="dxa" w:w="80"/>
+              <w:left w:type="dxa" w:w="120"/>
+              <w:bottom w:type="dxa" w:w="80"/>
+              <w:right w:type="dxa" w:w="120"/>
+            </w:tcMar>
+          </w:tcPr>
+          <w:p>
+            <w:pPr>
+              <w:spacing w:after="0" w:before="0"/>
+            </w:pPr>
+            <w:r>
+              <w:rPr>
+                <w:rFonts w:ascii="Arial" w:cs="Arial" w:eastAsia="Arial" w:hAnsi="Arial"/>
+                <w:sz w:val="21"/>
+                <w:szCs w:val="21"/>
+              </w:rPr>
+              <w:t xml:space="preserve"/>
+            </w:r>
+          </w:p>
+        </w:tc>
+      </w:tr>
+    </w:tbl>
+    <w:p>
+      <w:pPr>
+        <w:keepNext/>
+        <w:spacing w:after="60" w:before="280"/>
+      </w:pPr>
+      <w:r>
+        <w:rPr>
+          <w:rFonts w:ascii="Arial" w:cs="Arial" w:eastAsia="Arial" w:hAnsi="Arial"/>
+          <w:b/>
+          <w:bCs/>
+          <w:sz w:val="22"/>
+          <w:szCs w:val="22"/>
+        </w:rPr>
+        <w:t xml:space="preserve">6.  </w:t>
+      </w:r>
+      <w:r>
+        <w:rPr>
+          <w:rFonts w:ascii="Arial" w:cs="Arial" w:eastAsia="Arial" w:hAnsi="Arial"/>
+          <w:b/>
+          <w:bCs/>
+          <w:sz w:val="22"/>
+          <w:szCs w:val="22"/>
+        </w:rPr>
+        <w:t xml:space="preserve">When are your busy and quiet times of year?</w:t>
+      </w:r>
+    </w:p>
+    <w:p>
+      <w:pPr>
+        <w:keepNext/>
+        <w:spacing w:after="80" w:before="0"/>
+      </w:pPr>
+      <w:r>
+        <w:rPr>
+          <w:rFonts w:ascii="Arial" w:cs="Arial" w:eastAsia="Arial" w:hAnsi="Arial"/>
+          <w:color w:val="6F6F6F"/>
+          <w:sz w:val="19"/>
+          <w:szCs w:val="19"/>
+        </w:rPr>
+        <w:t xml:space="preserve">We'll plan your months around them.</w:t>
+      </w:r>
+    </w:p>
+    <w:p>
+      <w:pPr>
+        <w:keepNext/>
+        <w:spacing w:after="80" w:before="0"/>
+      </w:pPr>
+      <w:r>
+        <w:rPr>
+          <w:rFonts w:ascii="Arial" w:cs="Arial" w:eastAsia="Arial" w:hAnsi="Arial"/>
+          <w:i/>
+          <w:iCs/>
+          <w:color w:val="9A9A9A"/>
+          <w:sz w:val="18"/>
+          <w:szCs w:val="18"/>
+        </w:rPr>
+        <w:t xml:space="preserve">e.g. January is dead. June to August is flat out with winter sport injuries.</w:t>
+      </w:r>
+    </w:p>
+    <w:tbl>
+      <w:tblPr>
+        <w:tblW w:type="dxa" w:w="9638"/>
+        <w:tblBorders>
+          <w:top w:val="single" w:color="auto" w:sz="4"/>
+          <w:left w:val="single" w:color="auto" w:sz="4"/>
+          <w:bottom w:val="single" w:color="auto" w:sz="4"/>
+          <w:right w:val="single" w:color="auto" w:sz="4"/>
+          <w:insideH w:val="single" w:color="auto" w:sz="4"/>
+          <w:insideV w:val="single" w:color="auto" w:sz="4"/>
+        </w:tblBorders>
+      </w:tblPr>
+      <w:tblGrid>
+        <w:gridCol w:w="9638"/>
+      </w:tblGrid>
+      <w:tr>
+        <w:trPr>
+          <w:cantSplit/>
+          <w:trHeight w:val="1300" w:hRule="atLeast"/>
+        </w:trPr>
+        <w:tc>
+          <w:tcPr>
+            <w:tcW w:type="dxa" w:w="9638"/>
+            <w:tcBorders>
+              <w:top w:val="single" w:color="BFBFBF" w:sz="4"/>
+              <w:left w:val="single" w:color="BFBFBF" w:sz="4"/>
+              <w:bottom w:val="single" w:color="BFBFBF" w:sz="4"/>
+              <w:right w:val="single" w:color="BFBFBF" w:sz="4"/>
+            </w:tcBorders>
+            <w:tcMar>
+              <w:top w:type="dxa" w:w="80"/>
+              <w:left w:type="dxa" w:w="120"/>
+              <w:bottom w:type="dxa" w:w="80"/>
+              <w:right w:type="dxa" w:w="120"/>
+            </w:tcMar>
+          </w:tcPr>
+          <w:p>
+            <w:pPr>
+              <w:spacing w:after="0" w:before="0"/>
+            </w:pPr>
+            <w:r>
+              <w:rPr>
+                <w:rFonts w:ascii="Arial" w:cs="Arial" w:eastAsia="Arial" w:hAnsi="Arial"/>
+                <w:sz w:val="21"/>
+                <w:szCs w:val="21"/>
+              </w:rPr>
+              <w:t xml:space="preserve"/>
+            </w:r>
+          </w:p>
+        </w:tc>
+      </w:tr>
+    </w:tbl>
+    <w:p>
+      <w:pPr>
+        <w:keepNext/>
+        <w:spacing w:after="80" w:before="160"/>
+      </w:pPr>
+      <w:r>
+        <w:rPr>
+          <w:rFonts w:ascii="Arial" w:cs="Arial" w:eastAsia="Arial" w:hAnsi="Arial"/>
+          <w:b/>
+          <w:bCs/>
+          <w:caps/>
+          <w:color w:val="6F6F6F"/>
+          <w:spacing w:val="20"/>
+          <w:sz w:val="16"/>
+          <w:szCs w:val="16"/>
+        </w:rPr>
+        <w:t xml:space="preserve">Got more to say? Optional</w:t>
+      </w:r>
+    </w:p>
+    <w:tbl>
+      <w:tblPr>
+        <w:tblW w:type="dxa" w:w="9638"/>
+        <w:tblBorders>
+          <w:top w:val="single" w:color="auto" w:sz="4"/>
+          <w:left w:val="single" w:color="auto" w:sz="4"/>
+          <w:bottom w:val="single" w:color="auto" w:sz="4"/>
+          <w:right w:val="single" w:color="auto" w:sz="4"/>
+          <w:insideH w:val="single" w:color="auto" w:sz="4"/>
+          <w:insideV w:val="single" w:color="auto" w:sz="4"/>
+        </w:tblBorders>
+      </w:tblPr>
+      <w:tblGrid>
+        <w:gridCol w:w="3470"/>
+        <w:gridCol w:w="6168"/>
+      </w:tblGrid>
+      <w:tr>
+        <w:trPr>
+          <w:cantSplit/>
+          <w:trHeight w:val="700" w:hRule="atLeast"/>
+        </w:trPr>
+        <w:tc>
+          <w:tcPr>
+            <w:tcW w:type="dxa" w:w="3470"/>
+            <w:tcBorders>
+              <w:top w:val="single" w:color="BFBFBF" w:sz="4"/>
+              <w:left w:val="single" w:color="BFBFBF" w:sz="4"/>
+              <w:bottom w:val="single" w:color="BFBFBF" w:sz="4"/>
+              <w:right w:val="single" w:color="BFBFBF" w:sz="4"/>
+            </w:tcBorders>
+            <w:shd w:fill="F2F2F2" w:color="auto" w:val="clear"/>
+            <w:tcMar>
+              <w:top w:type="dxa" w:w="80"/>
+              <w:left w:type="dxa" w:w="120"/>
+              <w:bottom w:type="dxa" w:w="80"/>
+              <w:right w:type="dxa" w:w="120"/>
+            </w:tcMar>
+          </w:tcPr>
+          <w:p>
+            <w:pPr>
+              <w:spacing w:after="0" w:before="0"/>
+            </w:pPr>
+            <w:r>
+              <w:rPr>
+                <w:rFonts w:ascii="Arial" w:cs="Arial" w:eastAsia="Arial" w:hAnsi="Arial"/>
+                <w:color w:val="6F6F6F"/>
+                <w:sz w:val="18"/>
+                <w:szCs w:val="18"/>
+              </w:rPr>
+              <w:t xml:space="preserve">Launches, events, anniversaries or big dates coming up</w:t>
+            </w:r>
+          </w:p>
+        </w:tc>
+        <w:tc>
+          <w:tcPr>
+            <w:tcW w:type="dxa" w:w="6168"/>
+            <w:tcBorders>
+              <w:top w:val="single" w:color="BFBFBF" w:sz="4"/>
+              <w:left w:val="single" w:color="BFBFBF" w:sz="4"/>
+              <w:bottom w:val="single" w:color="BFBFBF" w:sz="4"/>
+              <w:right w:val="single" w:color="BFBFBF" w:sz="4"/>
+            </w:tcBorders>
+            <w:tcMar>
+              <w:top w:type="dxa" w:w="80"/>
+              <w:left w:type="dxa" w:w="120"/>
+              <w:bottom w:type="dxa" w:w="80"/>
+              <w:right w:type="dxa" w:w="120"/>
+            </w:tcMar>
+          </w:tcPr>
+          <w:p>
+            <w:pPr>
+              <w:spacing w:after="0" w:before="0"/>
+            </w:pPr>
+            <w:r>
+              <w:rPr>
+                <w:rFonts w:ascii="Arial" w:cs="Arial" w:eastAsia="Arial" w:hAnsi="Arial"/>
+                <w:sz w:val="21"/>
+                <w:szCs w:val="21"/>
+              </w:rPr>
+              <w:t xml:space="preserve"/>
+            </w:r>
+          </w:p>
+        </w:tc>
+      </w:tr>
+    </w:tbl>
+    <w:p>
+      <w:pPr>
+        <w:keepNext/>
+        <w:pBdr>
+          <w:bottom w:val="single" w:color="111111" w:sz="12" w:space="6"/>
+        </w:pBdr>
+        <w:spacing w:after="80" w:before="480"/>
+      </w:pPr>
+      <w:r>
+        <w:rPr>
+          <w:rFonts w:ascii="Arial" w:cs="Arial" w:eastAsia="Arial" w:hAnsi="Arial"/>
+          <w:color w:val="6F6F6F"/>
+          <w:sz w:val="20"/>
+          <w:szCs w:val="20"/>
+        </w:rPr>
+        <w:t xml:space="preserve">02   </w:t>
+      </w:r>
+      <w:r>
+        <w:rPr>
+          <w:rFonts w:ascii="Arial" w:cs="Arial" w:eastAsia="Arial" w:hAnsi="Arial"/>
+          <w:b/>
+          <w:bCs/>
+          <w:sz w:val="32"/>
+          <w:szCs w:val="32"/>
+        </w:rPr>
+        <w:t xml:space="preserve">Your Business</w:t>
+      </w:r>
+    </w:p>
+    <w:p>
+      <w:pPr>
+        <w:keepNext/>
+        <w:spacing w:after="60" w:before="280"/>
+      </w:pPr>
+      <w:r>
+        <w:rPr>
+          <w:rFonts w:ascii="Arial" w:cs="Arial" w:eastAsia="Arial" w:hAnsi="Arial"/>
+          <w:b/>
+          <w:bCs/>
+          <w:sz w:val="22"/>
+          <w:szCs w:val="22"/>
+        </w:rPr>
+        <w:t xml:space="preserve">7.  </w:t>
+      </w:r>
+      <w:r>
+        <w:rPr>
+          <w:rFonts w:ascii="Arial" w:cs="Arial" w:eastAsia="Arial" w:hAnsi="Arial"/>
+          <w:b/>
+          <w:bCs/>
+          <w:sz w:val="22"/>
+          <w:szCs w:val="22"/>
+        </w:rPr>
+        <w:t xml:space="preserve">Which package are you starting with?</w:t>
+      </w:r>
+    </w:p>
+    <w:p>
+      <w:pPr>
+        <w:keepNext/>
+        <w:spacing w:after="80" w:before="0"/>
+      </w:pPr>
+      <w:r>
+        <w:rPr>
+          <w:rFonts w:ascii="Arial" w:cs="Arial" w:eastAsia="Arial" w:hAnsi="Arial"/>
+          <w:color w:val="6F6F6F"/>
+          <w:sz w:val="19"/>
+          <w:szCs w:val="19"/>
+        </w:rPr>
+        <w:t xml:space="preserve">This just tells us which questions matter for you.</w:t>
+      </w:r>
+    </w:p>
+    <w:p>
+      <w:pPr>
+        <w:keepNext/>
+        <w:spacing w:after="80" w:before="0"/>
+      </w:pPr>
+      <w:r>
+        <w:rPr>
+          <w:rFonts w:ascii="Arial" w:cs="Arial" w:eastAsia="Arial" w:hAnsi="Arial"/>
+          <w:color w:val="6F6F6F"/>
+          <w:sz w:val="17"/>
+          <w:szCs w:val="17"/>
+        </w:rPr>
+        <w:t xml:space="preserve">Pick one. Swap ☐ for ☒, or highlight your pick.</w:t>
+      </w:r>
+    </w:p>
+    <w:p>
+      <w:pPr>
+        <w:keepNext w:val="false"/>
+        <w:spacing w:after="120" w:before="0" w:line="360"/>
+      </w:pPr>
+      <w:r>
+        <w:rPr>
+          <w:rFonts w:ascii="Arial" w:cs="Arial" w:eastAsia="Arial" w:hAnsi="Arial"/>
+          <w:sz w:val="21"/>
+          <w:szCs w:val="21"/>
+        </w:rPr>
+        <w:t xml:space="preserve">☐ Marketing Strategy</w:t>
+      </w:r>
+      <w:r>
+        <w:rPr>
+          <w:rFonts w:ascii="Arial" w:cs="Arial" w:eastAsia="Arial" w:hAnsi="Arial"/>
+          <w:sz w:val="21"/>
+          <w:szCs w:val="21"/>
+        </w:rPr>
+        <w:t xml:space="preserve">      ☐ ASAP Agency</w:t>
+      </w:r>
+      <w:r>
+        <w:rPr>
+          <w:rFonts w:ascii="Arial" w:cs="Arial" w:eastAsia="Arial" w:hAnsi="Arial"/>
+          <w:sz w:val="21"/>
+          <w:szCs w:val="21"/>
+        </w:rPr>
+        <w:t xml:space="preserve">      ☐ Custom Retainer</w:t>
+      </w:r>
+      <w:r>
+        <w:rPr>
+          <w:rFonts w:ascii="Arial" w:cs="Arial" w:eastAsia="Arial" w:hAnsi="Arial"/>
+          <w:sz w:val="21"/>
+          <w:szCs w:val="21"/>
+        </w:rPr>
+        <w:t xml:space="preserve">      ☐ Not sure yet</w:t>
+      </w:r>
+    </w:p>
+    <w:p>
+      <w:pPr>
+        <w:keepNext/>
+        <w:spacing w:after="60" w:before="280"/>
+      </w:pPr>
+      <w:r>
+        <w:rPr>
+          <w:rFonts w:ascii="Arial" w:cs="Arial" w:eastAsia="Arial" w:hAnsi="Arial"/>
+          <w:b/>
+          <w:bCs/>
+          <w:sz w:val="22"/>
+          <w:szCs w:val="22"/>
+        </w:rPr>
+        <w:t xml:space="preserve">8.  </w:t>
+      </w:r>
+      <w:r>
+        <w:rPr>
+          <w:rFonts w:ascii="Arial" w:cs="Arial" w:eastAsia="Arial" w:hAnsi="Arial"/>
+          <w:b/>
+          <w:bCs/>
+          <w:sz w:val="22"/>
+          <w:szCs w:val="22"/>
+        </w:rPr>
+        <w:t xml:space="preserve">What does your business do, in one sentence?</w:t>
+      </w:r>
+    </w:p>
+    <w:p>
+      <w:pPr>
+        <w:keepNext/>
+        <w:spacing w:after="80" w:before="0"/>
+      </w:pPr>
+      <w:r>
+        <w:rPr>
+          <w:rFonts w:ascii="Arial" w:cs="Arial" w:eastAsia="Arial" w:hAnsi="Arial"/>
+          <w:color w:val="6F6F6F"/>
+          <w:sz w:val="19"/>
+          <w:szCs w:val="19"/>
+        </w:rPr>
+        <w:t xml:space="preserve">Like you'd explain it to a 12-year-old.</w:t>
+      </w:r>
+    </w:p>
+    <w:p>
+      <w:pPr>
+        <w:keepNext/>
+        <w:spacing w:after="80" w:before="0"/>
+      </w:pPr>
+      <w:r>
+        <w:rPr>
+          <w:rFonts w:ascii="Arial" w:cs="Arial" w:eastAsia="Arial" w:hAnsi="Arial"/>
+          <w:i/>
+          <w:iCs/>
+          <w:color w:val="9A9A9A"/>
+          <w:sz w:val="18"/>
+          <w:szCs w:val="18"/>
+        </w:rPr>
+        <w:t xml:space="preserve">e.g. We fix sore backs and necks so people can get back to work and sport.</w:t>
+      </w:r>
+    </w:p>
+    <w:tbl>
+      <w:tblPr>
+        <w:tblW w:type="dxa" w:w="9638"/>
+        <w:tblBorders>
+          <w:top w:val="single" w:color="auto" w:sz="4"/>
+          <w:left w:val="single" w:color="auto" w:sz="4"/>
+          <w:bottom w:val="single" w:color="auto" w:sz="4"/>
+          <w:right w:val="single" w:color="auto" w:sz="4"/>
+          <w:insideH w:val="single" w:color="auto" w:sz="4"/>
+          <w:insideV w:val="single" w:color="auto" w:sz="4"/>
+        </w:tblBorders>
+      </w:tblPr>
+      <w:tblGrid>
+        <w:gridCol w:w="9638"/>
+      </w:tblGrid>
+      <w:tr>
+        <w:trPr>
+          <w:cantSplit/>
+          <w:trHeight w:val="1300" w:hRule="atLeast"/>
+        </w:trPr>
+        <w:tc>
+          <w:tcPr>
+            <w:tcW w:type="dxa" w:w="9638"/>
+            <w:tcBorders>
+              <w:top w:val="single" w:color="BFBFBF" w:sz="4"/>
+              <w:left w:val="single" w:color="BFBFBF" w:sz="4"/>
+              <w:bottom w:val="single" w:color="BFBFBF" w:sz="4"/>
+              <w:right w:val="single" w:color="BFBFBF" w:sz="4"/>
+            </w:tcBorders>
+            <w:tcMar>
+              <w:top w:type="dxa" w:w="80"/>
+              <w:left w:type="dxa" w:w="120"/>
+              <w:bottom w:type="dxa" w:w="80"/>
+              <w:right w:type="dxa" w:w="120"/>
+            </w:tcMar>
+          </w:tcPr>
+          <w:p>
+            <w:pPr>
+              <w:spacing w:after="0" w:before="0"/>
+            </w:pPr>
+            <w:r>
+              <w:rPr>
+                <w:rFonts w:ascii="Arial" w:cs="Arial" w:eastAsia="Arial" w:hAnsi="Arial"/>
+                <w:sz w:val="21"/>
+                <w:szCs w:val="21"/>
+              </w:rPr>
+              <w:t xml:space="preserve"/>
+            </w:r>
+          </w:p>
+        </w:tc>
+      </w:tr>
+    </w:tbl>
+    <w:p>
+      <w:pPr>
+        <w:keepNext/>
+        <w:spacing w:after="80" w:before="160"/>
+      </w:pPr>
+      <w:r>
+        <w:rPr>
+          <w:rFonts w:ascii="Arial" w:cs="Arial" w:eastAsia="Arial" w:hAnsi="Arial"/>
+          <w:b/>
+          <w:bCs/>
+          <w:caps/>
+          <w:color w:val="6F6F6F"/>
+          <w:spacing w:val="20"/>
+          <w:sz w:val="16"/>
+          <w:szCs w:val="16"/>
+        </w:rPr>
+        <w:t xml:space="preserve">Got more to say? Optional</w:t>
+      </w:r>
+    </w:p>
+    <w:tbl>
+      <w:tblPr>
+        <w:tblW w:type="dxa" w:w="9638"/>
+        <w:tblBorders>
+          <w:top w:val="single" w:color="auto" w:sz="4"/>
+          <w:left w:val="single" w:color="auto" w:sz="4"/>
+          <w:bottom w:val="single" w:color="auto" w:sz="4"/>
+          <w:right w:val="single" w:color="auto" w:sz="4"/>
+          <w:insideH w:val="single" w:color="auto" w:sz="4"/>
+          <w:insideV w:val="single" w:color="auto" w:sz="4"/>
+        </w:tblBorders>
+      </w:tblPr>
+      <w:tblGrid>
+        <w:gridCol w:w="3470"/>
+        <w:gridCol w:w="6168"/>
+      </w:tblGrid>
+      <w:tr>
+        <w:trPr>
+          <w:cantSplit/>
+          <w:trHeight w:val="700" w:hRule="atLeast"/>
+        </w:trPr>
+        <w:tc>
+          <w:tcPr>
+            <w:tcW w:type="dxa" w:w="3470"/>
+            <w:tcBorders>
+              <w:top w:val="single" w:color="BFBFBF" w:sz="4"/>
+              <w:left w:val="single" w:color="BFBFBF" w:sz="4"/>
+              <w:bottom w:val="single" w:color="BFBFBF" w:sz="4"/>
+              <w:right w:val="single" w:color="BFBFBF" w:sz="4"/>
+            </w:tcBorders>
+            <w:shd w:fill="F2F2F2" w:color="auto" w:val="clear"/>
+            <w:tcMar>
+              <w:top w:type="dxa" w:w="80"/>
+              <w:left w:type="dxa" w:w="120"/>
+              <w:bottom w:type="dxa" w:w="80"/>
+              <w:right w:type="dxa" w:w="120"/>
+            </w:tcMar>
+          </w:tcPr>
+          <w:p>
+            <w:pPr>
+              <w:spacing w:after="0" w:before="0"/>
+            </w:pPr>
+            <w:r>
+              <w:rPr>
+                <w:rFonts w:ascii="Arial" w:cs="Arial" w:eastAsia="Arial" w:hAnsi="Arial"/>
+                <w:color w:val="6F6F6F"/>
+                <w:sz w:val="18"/>
+                <w:szCs w:val="18"/>
+              </w:rPr>
               <w:t xml:space="preserve">Why did you start the business? The real reason, not the website version.</w:t>
             </w:r>
           </w:p>
@@ -779,7 +2202,7 @@
           <w:sz w:val="22"/>
           <w:szCs w:val="22"/>
         </w:rPr>
-        <w:t xml:space="preserve">3.  </w:t>
+        <w:t xml:space="preserve">9.  </w:t>
       </w:r>
       <w:r>
         <w:rPr>
@@ -1132,7 +2555,7 @@
           <w:sz w:val="20"/>
           <w:szCs w:val="20"/>
         </w:rPr>
-        <w:t xml:space="preserve">02   </w:t>
+        <w:t xml:space="preserve">03   </w:t>
       </w:r>
       <w:r>
         <w:rPr>
@@ -1142,7 +2565,7 @@
           <w:sz w:val="32"/>
           <w:szCs w:val="32"/>
         </w:rPr>
-        <w:t xml:space="preserve">Your Goals</w:t>
+        <w:t xml:space="preserve">Your Prices</w:t>
       </w:r>
     </w:p>
     <w:p>
@@ -1158,7 +2581,7 @@
           <w:sz w:val="22"/>
           <w:szCs w:val="22"/>
         </w:rPr>
-        <w:t xml:space="preserve">4.  </w:t>
+        <w:t xml:space="preserve">10.  </w:t>
       </w:r>
       <w:r>
         <w:rPr>
@@ -1168,7 +2591,7 @@
           <w:sz w:val="22"/>
           <w:szCs w:val="22"/>
         </w:rPr>
-        <w:t xml:space="preserve">What do you want your marketing to do for you over the next 3 to 12 months?</w:t>
+        <w:t xml:space="preserve">What do you sell, and what does it cost?</w:t>
       </w:r>
     </w:p>
     <w:p>
@@ -1183,42 +2606,7 @@
           <w:sz w:val="19"/>
           <w:szCs w:val="19"/>
         </w:rPr>
-        <w:t xml:space="preserve">Be specific if you can: more of a certain service, fill quiet days, hire staff, launch something, open a second site.</w:t>
-      </w:r>
-    </w:p>
-    <w:p>
-      <w:pPr>
-        <w:keepNext/>
-        <w:spacing w:after="80" w:before="0"/>
-      </w:pPr>
-      <w:r>
-        <w:rPr>
-          <w:rFonts w:ascii="Arial" w:cs="Arial" w:eastAsia="Arial" w:hAnsi="Arial"/>
-          <w:b/>
-          <w:bCs/>
-          <w:caps/>
-          <w:spacing w:val="20"/>
-          <w:sz w:val="16"/>
-          <w:szCs w:val="16"/>
-        </w:rPr>
-        <w:t xml:space="preserve">We need this one to plan your content</w:t>
-      </w:r>
-    </w:p>
-    <w:p>
-      <w:pPr>
-        <w:keepNext/>
-        <w:spacing w:after="80" w:before="0"/>
-      </w:pPr>
-      <w:r>
-        <w:rPr>
-          <w:rFonts w:ascii="Arial" w:cs="Arial" w:eastAsia="Arial" w:hAnsi="Arial"/>
-          <w:i/>
-          <w:iCs/>
-          <w:color w:val="9A9A9A"/>
-          <w:sz w:val="18"/>
-          <w:szCs w:val="18"/>
-        </w:rPr>
-        <w:t xml:space="preserve">e.g. Fill our Tuesday and Wednesday afternoons, and get more people booking pregnancy massage.</w:t>
+        <w:t xml:space="preserve">Real prices only. One line per service or product. We never make up a price.</w:t>
       </w:r>
     </w:p>
     <w:tbl>
@@ -1234,110 +2622,17 @@
         </w:tblBorders>
       </w:tblPr>
       <w:tblGrid>
-        <w:gridCol w:w="9638"/>
+        <w:gridCol w:w="4819"/>
+        <w:gridCol w:w="2409"/>
+        <w:gridCol w:w="2410"/>
       </w:tblGrid>
       <w:tr>
         <w:trPr>
-          <w:cantSplit/>
-          <w:trHeight w:val="1300" w:hRule="atLeast"/>
+          <w:tblHeader/>
         </w:trPr>
         <w:tc>
           <w:tcPr>
-            <w:tcW w:type="dxa" w:w="9638"/>
-            <w:tcBorders>
-              <w:top w:val="single" w:color="BFBFBF" w:sz="4"/>
-              <w:left w:val="single" w:color="BFBFBF" w:sz="4"/>
-              <w:bottom w:val="single" w:color="BFBFBF" w:sz="4"/>
-              <w:right w:val="single" w:color="BFBFBF" w:sz="4"/>
-            </w:tcBorders>
-            <w:tcMar>
-              <w:top w:type="dxa" w:w="80"/>
-              <w:left w:type="dxa" w:w="120"/>
-              <w:bottom w:type="dxa" w:w="80"/>
-              <w:right w:type="dxa" w:w="120"/>
-            </w:tcMar>
-          </w:tcPr>
-          <w:p>
-            <w:pPr>
-              <w:spacing w:after="0" w:before="0"/>
-            </w:pPr>
-            <w:r>
-              <w:rPr>
-                <w:rFonts w:ascii="Arial" w:cs="Arial" w:eastAsia="Arial" w:hAnsi="Arial"/>
-                <w:sz w:val="21"/>
-                <w:szCs w:val="21"/>
-              </w:rPr>
-              <w:t xml:space="preserve"/>
-            </w:r>
-          </w:p>
-        </w:tc>
-      </w:tr>
-    </w:tbl>
-    <w:p>
-      <w:pPr>
-        <w:keepNext/>
-        <w:spacing w:after="60" w:before="280"/>
-      </w:pPr>
-      <w:r>
-        <w:rPr>
-          <w:rFonts w:ascii="Arial" w:cs="Arial" w:eastAsia="Arial" w:hAnsi="Arial"/>
-          <w:b/>
-          <w:bCs/>
-          <w:sz w:val="22"/>
-          <w:szCs w:val="22"/>
-        </w:rPr>
-        <w:t xml:space="preserve">5.  </w:t>
-      </w:r>
-      <w:r>
-        <w:rPr>
-          <w:rFonts w:ascii="Arial" w:cs="Arial" w:eastAsia="Arial" w:hAnsi="Arial"/>
-          <w:b/>
-          <w:bCs/>
-          <w:sz w:val="22"/>
-          <w:szCs w:val="22"/>
-        </w:rPr>
-        <w:t xml:space="preserve">How will we know it's working?</w:t>
-      </w:r>
-    </w:p>
-    <w:p>
-      <w:pPr>
-        <w:keepNext/>
-        <w:spacing w:after="80" w:before="0"/>
-      </w:pPr>
-      <w:r>
-        <w:rPr>
-          <w:rFonts w:ascii="Arial" w:cs="Arial" w:eastAsia="Arial" w:hAnsi="Arial"/>
-          <w:color w:val="6F6F6F"/>
-          <w:sz w:val="19"/>
-          <w:szCs w:val="19"/>
-        </w:rPr>
-        <w:t xml:space="preserve">Rough numbers are perfect. Knowing where you're starting lets us show you what's moved.</w:t>
-      </w:r>
-    </w:p>
-    <w:tbl>
-      <w:tblPr>
-        <w:tblW w:type="dxa" w:w="9638"/>
-        <w:tblBorders>
-          <w:top w:val="single" w:color="auto" w:sz="4"/>
-          <w:left w:val="single" w:color="auto" w:sz="4"/>
-          <w:bottom w:val="single" w:color="auto" w:sz="4"/>
-          <w:right w:val="single" w:color="auto" w:sz="4"/>
-          <w:insideH w:val="single" w:color="auto" w:sz="4"/>
-          <w:insideV w:val="single" w:color="auto" w:sz="4"/>
-        </w:tblBorders>
-      </w:tblPr>
-      <w:tblGrid>
-        <w:gridCol w:w="3470"/>
-        <w:gridCol w:w="6168"/>
-      </w:tblGrid>
-      <w:tr>
-        <w:trPr>
-          <w:cantSplit/>
-          <w:trHeight w:val="520" w:hRule="atLeast"/>
-        </w:trPr>
-        <w:tc>
-          <w:tcPr>
-            <w:tcW w:type="dxa" w:w="3470"/>
+            <w:tcW w:type="dxa" w:w="4819"/>
             <w:tcBorders>
               <w:top w:val="single" w:color="BFBFBF" w:sz="4"/>
               <w:left w:val="single" w:color="BFBFBF" w:sz="4"/>
@@ -1359,41 +2654,78 @@
             <w:r>
               <w:rPr>
                 <w:rFonts w:ascii="Arial" w:cs="Arial" w:eastAsia="Arial" w:hAnsi="Arial"/>
-                <w:color w:val="6F6F6F"/>
+                <w:b/>
+                <w:bCs/>
                 <w:sz w:val="18"/>
                 <w:szCs w:val="18"/>
               </w:rPr>
-              <w:t xml:space="preserve">What a win looks like in 3 months</w:t>
-            </w:r>
-          </w:p>
-        </w:tc>
-        <w:tc>
-          <w:tcPr>
-            <w:tcW w:type="dxa" w:w="6168"/>
-            <w:tcBorders>
-              <w:top w:val="single" w:color="BFBFBF" w:sz="4"/>
-              <w:left w:val="single" w:color="BFBFBF" w:sz="4"/>
-              <w:bottom w:val="single" w:color="BFBFBF" w:sz="4"/>
-              <w:right w:val="single" w:color="BFBFBF" w:sz="4"/>
-            </w:tcBorders>
-            <w:tcMar>
-              <w:top w:type="dxa" w:w="80"/>
-              <w:left w:type="dxa" w:w="120"/>
-              <w:bottom w:type="dxa" w:w="80"/>
-              <w:right w:type="dxa" w:w="120"/>
-            </w:tcMar>
-          </w:tcPr>
-          <w:p>
-            <w:pPr>
-              <w:spacing w:after="0" w:before="0"/>
-            </w:pPr>
-            <w:r>
-              <w:rPr>
-                <w:rFonts w:ascii="Arial" w:cs="Arial" w:eastAsia="Arial" w:hAnsi="Arial"/>
-                <w:sz w:val="21"/>
-                <w:szCs w:val="21"/>
-              </w:rPr>
-              <w:t xml:space="preserve"/>
+              <w:t xml:space="preserve">Service or product</w:t>
+            </w:r>
+          </w:p>
+        </w:tc>
+        <w:tc>
+          <w:tcPr>
+            <w:tcW w:type="dxa" w:w="2409"/>
+            <w:tcBorders>
+              <w:top w:val="single" w:color="BFBFBF" w:sz="4"/>
+              <w:left w:val="single" w:color="BFBFBF" w:sz="4"/>
+              <w:bottom w:val="single" w:color="BFBFBF" w:sz="4"/>
+              <w:right w:val="single" w:color="BFBFBF" w:sz="4"/>
+            </w:tcBorders>
+            <w:shd w:fill="F2F2F2" w:color="auto" w:val="clear"/>
+            <w:tcMar>
+              <w:top w:type="dxa" w:w="80"/>
+              <w:left w:type="dxa" w:w="120"/>
+              <w:bottom w:type="dxa" w:w="80"/>
+              <w:right w:type="dxa" w:w="120"/>
+            </w:tcMar>
+          </w:tcPr>
+          <w:p>
+            <w:pPr>
+              <w:spacing w:after="0" w:before="0"/>
+            </w:pPr>
+            <w:r>
+              <w:rPr>
+                <w:rFonts w:ascii="Arial" w:cs="Arial" w:eastAsia="Arial" w:hAnsi="Arial"/>
+                <w:b/>
+                <w:bCs/>
+                <w:sz w:val="18"/>
+                <w:szCs w:val="18"/>
+              </w:rPr>
+              <w:t xml:space="preserve">Price ($)</w:t>
+            </w:r>
+          </w:p>
+        </w:tc>
+        <w:tc>
+          <w:tcPr>
+            <w:tcW w:type="dxa" w:w="2410"/>
+            <w:tcBorders>
+              <w:top w:val="single" w:color="BFBFBF" w:sz="4"/>
+              <w:left w:val="single" w:color="BFBFBF" w:sz="4"/>
+              <w:bottom w:val="single" w:color="BFBFBF" w:sz="4"/>
+              <w:right w:val="single" w:color="BFBFBF" w:sz="4"/>
+            </w:tcBorders>
+            <w:shd w:fill="F2F2F2" w:color="auto" w:val="clear"/>
+            <w:tcMar>
+              <w:top w:type="dxa" w:w="80"/>
+              <w:left w:type="dxa" w:w="120"/>
+              <w:bottom w:type="dxa" w:w="80"/>
+              <w:right w:type="dxa" w:w="120"/>
+            </w:tcMar>
+          </w:tcPr>
+          <w:p>
+            <w:pPr>
+              <w:spacing w:after="0" w:before="0"/>
+            </w:pPr>
+            <w:r>
+              <w:rPr>
+                <w:rFonts w:ascii="Arial" w:cs="Arial" w:eastAsia="Arial" w:hAnsi="Arial"/>
+                <w:b/>
+                <w:bCs/>
+                <w:sz w:val="18"/>
+                <w:szCs w:val="18"/>
+              </w:rPr>
+              <w:t xml:space="preserve">Length or size</w:t>
             </w:r>
           </w:p>
         </w:tc>
@@ -1401,43 +2733,71 @@
       <w:tr>
         <w:trPr>
           <w:cantSplit/>
-          <w:trHeight w:val="520" w:hRule="atLeast"/>
+          <w:trHeight w:val="460" w:hRule="atLeast"/>
         </w:trPr>
         <w:tc>
           <w:tcPr>
-            <w:tcW w:type="dxa" w:w="3470"/>
-            <w:tcBorders>
-              <w:top w:val="single" w:color="BFBFBF" w:sz="4"/>
-              <w:left w:val="single" w:color="BFBFBF" w:sz="4"/>
-              <w:bottom w:val="single" w:color="BFBFBF" w:sz="4"/>
-              <w:right w:val="single" w:color="BFBFBF" w:sz="4"/>
-            </w:tcBorders>
-            <w:shd w:fill="F2F2F2" w:color="auto" w:val="clear"/>
-            <w:tcMar>
-              <w:top w:type="dxa" w:w="80"/>
-              <w:left w:type="dxa" w:w="120"/>
-              <w:bottom w:type="dxa" w:w="80"/>
-              <w:right w:type="dxa" w:w="120"/>
-            </w:tcMar>
-          </w:tcPr>
-          <w:p>
-            <w:pPr>
-              <w:spacing w:after="0" w:before="0"/>
-            </w:pPr>
-            <w:r>
-              <w:rPr>
-                <w:rFonts w:ascii="Arial" w:cs="Arial" w:eastAsia="Arial" w:hAnsi="Arial"/>
-                <w:color w:val="6F6F6F"/>
-                <w:sz w:val="18"/>
-                <w:szCs w:val="18"/>
-              </w:rPr>
-              <w:t xml:space="preserve">How you'll measure it</w:t>
-            </w:r>
-          </w:p>
-        </w:tc>
-        <w:tc>
-          <w:tcPr>
-            <w:tcW w:type="dxa" w:w="6168"/>
+            <w:tcW w:type="dxa" w:w="4819"/>
+            <w:tcBorders>
+              <w:top w:val="single" w:color="BFBFBF" w:sz="4"/>
+              <w:left w:val="single" w:color="BFBFBF" w:sz="4"/>
+              <w:bottom w:val="single" w:color="BFBFBF" w:sz="4"/>
+              <w:right w:val="single" w:color="BFBFBF" w:sz="4"/>
+            </w:tcBorders>
+            <w:tcMar>
+              <w:top w:type="dxa" w:w="80"/>
+              <w:left w:type="dxa" w:w="120"/>
+              <w:bottom w:type="dxa" w:w="80"/>
+              <w:right w:type="dxa" w:w="120"/>
+            </w:tcMar>
+          </w:tcPr>
+          <w:p>
+            <w:pPr>
+              <w:spacing w:after="0" w:before="0"/>
+            </w:pPr>
+            <w:r>
+              <w:rPr>
+                <w:rFonts w:ascii="Arial" w:cs="Arial" w:eastAsia="Arial" w:hAnsi="Arial"/>
+                <w:sz w:val="21"/>
+                <w:szCs w:val="21"/>
+              </w:rPr>
+              <w:t xml:space="preserve"/>
+            </w:r>
+          </w:p>
+        </w:tc>
+        <w:tc>
+          <w:tcPr>
+            <w:tcW w:type="dxa" w:w="2409"/>
+            <w:tcBorders>
+              <w:top w:val="single" w:color="BFBFBF" w:sz="4"/>
+              <w:left w:val="single" w:color="BFBFBF" w:sz="4"/>
+              <w:bottom w:val="single" w:color="BFBFBF" w:sz="4"/>
+              <w:right w:val="single" w:color="BFBFBF" w:sz="4"/>
+            </w:tcBorders>
+            <w:tcMar>
+              <w:top w:type="dxa" w:w="80"/>
+              <w:left w:type="dxa" w:w="120"/>
+              <w:bottom w:type="dxa" w:w="80"/>
+              <w:right w:type="dxa" w:w="120"/>
+            </w:tcMar>
+          </w:tcPr>
+          <w:p>
+            <w:pPr>
+              <w:spacing w:after="0" w:before="0"/>
+            </w:pPr>
+            <w:r>
+              <w:rPr>
+                <w:rFonts w:ascii="Arial" w:cs="Arial" w:eastAsia="Arial" w:hAnsi="Arial"/>
+                <w:sz w:val="21"/>
+                <w:szCs w:val="21"/>
+              </w:rPr>
+              <w:t xml:space="preserve"/>
+            </w:r>
+          </w:p>
+        </w:tc>
+        <w:tc>
+          <w:tcPr>
+            <w:tcW w:type="dxa" w:w="2410"/>
             <w:tcBorders>
               <w:top w:val="single" w:color="BFBFBF" w:sz="4"/>
               <w:left w:val="single" w:color="BFBFBF" w:sz="4"/>
@@ -1469,169 +2829,71 @@
       <w:tr>
         <w:trPr>
           <w:cantSplit/>
-          <w:trHeight w:val="520" w:hRule="atLeast"/>
+          <w:trHeight w:val="460" w:hRule="atLeast"/>
         </w:trPr>
         <w:tc>
           <w:tcPr>
-            <w:tcW w:type="dxa" w:w="3470"/>
-            <w:tcBorders>
-              <w:top w:val="single" w:color="BFBFBF" w:sz="4"/>
-              <w:left w:val="single" w:color="BFBFBF" w:sz="4"/>
-              <w:bottom w:val="single" w:color="BFBFBF" w:sz="4"/>
-              <w:right w:val="single" w:color="BFBFBF" w:sz="4"/>
-            </w:tcBorders>
-            <w:shd w:fill="F2F2F2" w:color="auto" w:val="clear"/>
-            <w:tcMar>
-              <w:top w:type="dxa" w:w="80"/>
-              <w:left w:type="dxa" w:w="120"/>
-              <w:bottom w:type="dxa" w:w="80"/>
-              <w:right w:type="dxa" w:w="120"/>
-            </w:tcMar>
-          </w:tcPr>
-          <w:p>
-            <w:pPr>
-              <w:spacing w:after="0" w:before="0"/>
-            </w:pPr>
-            <w:r>
-              <w:rPr>
-                <w:rFonts w:ascii="Arial" w:cs="Arial" w:eastAsia="Arial" w:hAnsi="Arial"/>
-                <w:color w:val="6F6F6F"/>
-                <w:sz w:val="18"/>
-                <w:szCs w:val="18"/>
-              </w:rPr>
-              <w:t xml:space="preserve">Where that's at today</w:t>
-            </w:r>
-          </w:p>
-        </w:tc>
-        <w:tc>
-          <w:tcPr>
-            <w:tcW w:type="dxa" w:w="6168"/>
-            <w:tcBorders>
-              <w:top w:val="single" w:color="BFBFBF" w:sz="4"/>
-              <w:left w:val="single" w:color="BFBFBF" w:sz="4"/>
-              <w:bottom w:val="single" w:color="BFBFBF" w:sz="4"/>
-              <w:right w:val="single" w:color="BFBFBF" w:sz="4"/>
-            </w:tcBorders>
-            <w:tcMar>
-              <w:top w:type="dxa" w:w="80"/>
-              <w:left w:type="dxa" w:w="120"/>
-              <w:bottom w:type="dxa" w:w="80"/>
-              <w:right w:type="dxa" w:w="120"/>
-            </w:tcMar>
-          </w:tcPr>
-          <w:p>
-            <w:pPr>
-              <w:spacing w:after="0" w:before="0"/>
-            </w:pPr>
-            <w:r>
-              <w:rPr>
-                <w:rFonts w:ascii="Arial" w:cs="Arial" w:eastAsia="Arial" w:hAnsi="Arial"/>
-                <w:sz w:val="21"/>
-                <w:szCs w:val="21"/>
-              </w:rPr>
-              <w:t xml:space="preserve"/>
-            </w:r>
-          </w:p>
-        </w:tc>
-      </w:tr>
-    </w:tbl>
-    <w:p>
-      <w:pPr>
-        <w:keepNext/>
-        <w:spacing w:after="60" w:before="280"/>
-      </w:pPr>
-      <w:r>
-        <w:rPr>
-          <w:rFonts w:ascii="Arial" w:cs="Arial" w:eastAsia="Arial" w:hAnsi="Arial"/>
-          <w:b/>
-          <w:bCs/>
-          <w:sz w:val="22"/>
-          <w:szCs w:val="22"/>
-        </w:rPr>
-        <w:t xml:space="preserve">6.  </w:t>
-      </w:r>
-      <w:r>
-        <w:rPr>
-          <w:rFonts w:ascii="Arial" w:cs="Arial" w:eastAsia="Arial" w:hAnsi="Arial"/>
-          <w:b/>
-          <w:bCs/>
-          <w:sz w:val="22"/>
-          <w:szCs w:val="22"/>
-        </w:rPr>
-        <w:t xml:space="preserve">What are your numbers right now?</w:t>
-      </w:r>
-    </w:p>
-    <w:p>
-      <w:pPr>
-        <w:keepNext/>
-        <w:spacing w:after="80" w:before="0"/>
-      </w:pPr>
-      <w:r>
-        <w:rPr>
-          <w:rFonts w:ascii="Arial" w:cs="Arial" w:eastAsia="Arial" w:hAnsi="Arial"/>
-          <w:color w:val="6F6F6F"/>
-          <w:sz w:val="19"/>
-          <w:szCs w:val="19"/>
-        </w:rPr>
-        <w:t xml:space="preserve">Rough is fine. These turn your strategy from a guess into a plan. Skip any you don't know.</w:t>
-      </w:r>
-    </w:p>
-    <w:tbl>
-      <w:tblPr>
-        <w:tblW w:type="dxa" w:w="9638"/>
-        <w:tblBorders>
-          <w:top w:val="single" w:color="auto" w:sz="4"/>
-          <w:left w:val="single" w:color="auto" w:sz="4"/>
-          <w:bottom w:val="single" w:color="auto" w:sz="4"/>
-          <w:right w:val="single" w:color="auto" w:sz="4"/>
-          <w:insideH w:val="single" w:color="auto" w:sz="4"/>
-          <w:insideV w:val="single" w:color="auto" w:sz="4"/>
-        </w:tblBorders>
-      </w:tblPr>
-      <w:tblGrid>
-        <w:gridCol w:w="3470"/>
-        <w:gridCol w:w="6168"/>
-      </w:tblGrid>
-      <w:tr>
-        <w:trPr>
-          <w:cantSplit/>
-          <w:trHeight w:val="520" w:hRule="atLeast"/>
-        </w:trPr>
-        <w:tc>
-          <w:tcPr>
-            <w:tcW w:type="dxa" w:w="3470"/>
-            <w:tcBorders>
-              <w:top w:val="single" w:color="BFBFBF" w:sz="4"/>
-              <w:left w:val="single" w:color="BFBFBF" w:sz="4"/>
-              <w:bottom w:val="single" w:color="BFBFBF" w:sz="4"/>
-              <w:right w:val="single" w:color="BFBFBF" w:sz="4"/>
-            </w:tcBorders>
-            <w:shd w:fill="F2F2F2" w:color="auto" w:val="clear"/>
-            <w:tcMar>
-              <w:top w:type="dxa" w:w="80"/>
-              <w:left w:type="dxa" w:w="120"/>
-              <w:bottom w:type="dxa" w:w="80"/>
-              <w:right w:type="dxa" w:w="120"/>
-            </w:tcMar>
-          </w:tcPr>
-          <w:p>
-            <w:pPr>
-              <w:spacing w:after="0" w:before="0"/>
-            </w:pPr>
-            <w:r>
-              <w:rPr>
-                <w:rFonts w:ascii="Arial" w:cs="Arial" w:eastAsia="Arial" w:hAnsi="Arial"/>
-                <w:color w:val="6F6F6F"/>
-                <w:sz w:val="18"/>
-                <w:szCs w:val="18"/>
-              </w:rPr>
-              <w:t xml:space="preserve">Enquiries or bookings a month</w:t>
-            </w:r>
-          </w:p>
-        </w:tc>
-        <w:tc>
-          <w:tcPr>
-            <w:tcW w:type="dxa" w:w="6168"/>
+            <w:tcW w:type="dxa" w:w="4819"/>
+            <w:tcBorders>
+              <w:top w:val="single" w:color="BFBFBF" w:sz="4"/>
+              <w:left w:val="single" w:color="BFBFBF" w:sz="4"/>
+              <w:bottom w:val="single" w:color="BFBFBF" w:sz="4"/>
+              <w:right w:val="single" w:color="BFBFBF" w:sz="4"/>
+            </w:tcBorders>
+            <w:tcMar>
+              <w:top w:type="dxa" w:w="80"/>
+              <w:left w:type="dxa" w:w="120"/>
+              <w:bottom w:type="dxa" w:w="80"/>
+              <w:right w:type="dxa" w:w="120"/>
+            </w:tcMar>
+          </w:tcPr>
+          <w:p>
+            <w:pPr>
+              <w:spacing w:after="0" w:before="0"/>
+            </w:pPr>
+            <w:r>
+              <w:rPr>
+                <w:rFonts w:ascii="Arial" w:cs="Arial" w:eastAsia="Arial" w:hAnsi="Arial"/>
+                <w:sz w:val="21"/>
+                <w:szCs w:val="21"/>
+              </w:rPr>
+              <w:t xml:space="preserve"/>
+            </w:r>
+          </w:p>
+        </w:tc>
+        <w:tc>
+          <w:tcPr>
+            <w:tcW w:type="dxa" w:w="2409"/>
+            <w:tcBorders>
+              <w:top w:val="single" w:color="BFBFBF" w:sz="4"/>
+              <w:left w:val="single" w:color="BFBFBF" w:sz="4"/>
+              <w:bottom w:val="single" w:color="BFBFBF" w:sz="4"/>
+              <w:right w:val="single" w:color="BFBFBF" w:sz="4"/>
+            </w:tcBorders>
+            <w:tcMar>
+              <w:top w:type="dxa" w:w="80"/>
+              <w:left w:type="dxa" w:w="120"/>
+              <w:bottom w:type="dxa" w:w="80"/>
+              <w:right w:type="dxa" w:w="120"/>
+            </w:tcMar>
+          </w:tcPr>
+          <w:p>
+            <w:pPr>
+              <w:spacing w:after="0" w:before="0"/>
+            </w:pPr>
+            <w:r>
+              <w:rPr>
+                <w:rFonts w:ascii="Arial" w:cs="Arial" w:eastAsia="Arial" w:hAnsi="Arial"/>
+                <w:sz w:val="21"/>
+                <w:szCs w:val="21"/>
+              </w:rPr>
+              <w:t xml:space="preserve"/>
+            </w:r>
+          </w:p>
+        </w:tc>
+        <w:tc>
+          <w:tcPr>
+            <w:tcW w:type="dxa" w:w="2410"/>
             <w:tcBorders>
               <w:top w:val="single" w:color="BFBFBF" w:sz="4"/>
               <w:left w:val="single" w:color="BFBFBF" w:sz="4"/>
@@ -1663,43 +2925,71 @@
       <w:tr>
         <w:trPr>
           <w:cantSplit/>
-          <w:trHeight w:val="520" w:hRule="atLeast"/>
+          <w:trHeight w:val="460" w:hRule="atLeast"/>
         </w:trPr>
         <w:tc>
           <w:tcPr>
-            <w:tcW w:type="dxa" w:w="3470"/>
-            <w:tcBorders>
-              <w:top w:val="single" w:color="BFBFBF" w:sz="4"/>
-              <w:left w:val="single" w:color="BFBFBF" w:sz="4"/>
-              <w:bottom w:val="single" w:color="BFBFBF" w:sz="4"/>
-              <w:right w:val="single" w:color="BFBFBF" w:sz="4"/>
-            </w:tcBorders>
-            <w:shd w:fill="F2F2F2" w:color="auto" w:val="clear"/>
-            <w:tcMar>
-              <w:top w:type="dxa" w:w="80"/>
-              <w:left w:type="dxa" w:w="120"/>
-              <w:bottom w:type="dxa" w:w="80"/>
-              <w:right w:type="dxa" w:w="120"/>
-            </w:tcMar>
-          </w:tcPr>
-          <w:p>
-            <w:pPr>
-              <w:spacing w:after="0" w:before="0"/>
-            </w:pPr>
-            <w:r>
-              <w:rPr>
-                <w:rFonts w:ascii="Arial" w:cs="Arial" w:eastAsia="Arial" w:hAnsi="Arial"/>
-                <w:color w:val="6F6F6F"/>
-                <w:sz w:val="18"/>
-                <w:szCs w:val="18"/>
-              </w:rPr>
-              <w:t xml:space="preserve">How many more customers you could take</w:t>
-            </w:r>
-          </w:p>
-        </w:tc>
-        <w:tc>
-          <w:tcPr>
-            <w:tcW w:type="dxa" w:w="6168"/>
+            <w:tcW w:type="dxa" w:w="4819"/>
+            <w:tcBorders>
+              <w:top w:val="single" w:color="BFBFBF" w:sz="4"/>
+              <w:left w:val="single" w:color="BFBFBF" w:sz="4"/>
+              <w:bottom w:val="single" w:color="BFBFBF" w:sz="4"/>
+              <w:right w:val="single" w:color="BFBFBF" w:sz="4"/>
+            </w:tcBorders>
+            <w:tcMar>
+              <w:top w:type="dxa" w:w="80"/>
+              <w:left w:type="dxa" w:w="120"/>
+              <w:bottom w:type="dxa" w:w="80"/>
+              <w:right w:type="dxa" w:w="120"/>
+            </w:tcMar>
+          </w:tcPr>
+          <w:p>
+            <w:pPr>
+              <w:spacing w:after="0" w:before="0"/>
+            </w:pPr>
+            <w:r>
+              <w:rPr>
+                <w:rFonts w:ascii="Arial" w:cs="Arial" w:eastAsia="Arial" w:hAnsi="Arial"/>
+                <w:sz w:val="21"/>
+                <w:szCs w:val="21"/>
+              </w:rPr>
+              <w:t xml:space="preserve"/>
+            </w:r>
+          </w:p>
+        </w:tc>
+        <w:tc>
+          <w:tcPr>
+            <w:tcW w:type="dxa" w:w="2409"/>
+            <w:tcBorders>
+              <w:top w:val="single" w:color="BFBFBF" w:sz="4"/>
+              <w:left w:val="single" w:color="BFBFBF" w:sz="4"/>
+              <w:bottom w:val="single" w:color="BFBFBF" w:sz="4"/>
+              <w:right w:val="single" w:color="BFBFBF" w:sz="4"/>
+            </w:tcBorders>
+            <w:tcMar>
+              <w:top w:type="dxa" w:w="80"/>
+              <w:left w:type="dxa" w:w="120"/>
+              <w:bottom w:type="dxa" w:w="80"/>
+              <w:right w:type="dxa" w:w="120"/>
+            </w:tcMar>
+          </w:tcPr>
+          <w:p>
+            <w:pPr>
+              <w:spacing w:after="0" w:before="0"/>
+            </w:pPr>
+            <w:r>
+              <w:rPr>
+                <w:rFonts w:ascii="Arial" w:cs="Arial" w:eastAsia="Arial" w:hAnsi="Arial"/>
+                <w:sz w:val="21"/>
+                <w:szCs w:val="21"/>
+              </w:rPr>
+              <w:t xml:space="preserve"/>
+            </w:r>
+          </w:p>
+        </w:tc>
+        <w:tc>
+          <w:tcPr>
+            <w:tcW w:type="dxa" w:w="2410"/>
             <w:tcBorders>
               <w:top w:val="single" w:color="BFBFBF" w:sz="4"/>
               <w:left w:val="single" w:color="BFBFBF" w:sz="4"/>
@@ -1731,43 +3021,71 @@
       <w:tr>
         <w:trPr>
           <w:cantSplit/>
-          <w:trHeight w:val="520" w:hRule="atLeast"/>
+          <w:trHeight w:val="460" w:hRule="atLeast"/>
         </w:trPr>
         <w:tc>
           <w:tcPr>
-            <w:tcW w:type="dxa" w:w="3470"/>
-            <w:tcBorders>
-              <w:top w:val="single" w:color="BFBFBF" w:sz="4"/>
-              <w:left w:val="single" w:color="BFBFBF" w:sz="4"/>
-              <w:bottom w:val="single" w:color="BFBFBF" w:sz="4"/>
-              <w:right w:val="single" w:color="BFBFBF" w:sz="4"/>
-            </w:tcBorders>
-            <w:shd w:fill="F2F2F2" w:color="auto" w:val="clear"/>
-            <w:tcMar>
-              <w:top w:type="dxa" w:w="80"/>
-              <w:left w:type="dxa" w:w="120"/>
-              <w:bottom w:type="dxa" w:w="80"/>
-              <w:right w:type="dxa" w:w="120"/>
-            </w:tcMar>
-          </w:tcPr>
-          <w:p>
-            <w:pPr>
-              <w:spacing w:after="0" w:before="0"/>
-            </w:pPr>
-            <w:r>
-              <w:rPr>
-                <w:rFonts w:ascii="Arial" w:cs="Arial" w:eastAsia="Arial" w:hAnsi="Arial"/>
-                <w:color w:val="6F6F6F"/>
-                <w:sz w:val="18"/>
-                <w:szCs w:val="18"/>
-              </w:rPr>
-              <w:t xml:space="preserve">Your most profitable service or product</w:t>
-            </w:r>
-          </w:p>
-        </w:tc>
-        <w:tc>
-          <w:tcPr>
-            <w:tcW w:type="dxa" w:w="6168"/>
+            <w:tcW w:type="dxa" w:w="4819"/>
+            <w:tcBorders>
+              <w:top w:val="single" w:color="BFBFBF" w:sz="4"/>
+              <w:left w:val="single" w:color="BFBFBF" w:sz="4"/>
+              <w:bottom w:val="single" w:color="BFBFBF" w:sz="4"/>
+              <w:right w:val="single" w:color="BFBFBF" w:sz="4"/>
+            </w:tcBorders>
+            <w:tcMar>
+              <w:top w:type="dxa" w:w="80"/>
+              <w:left w:type="dxa" w:w="120"/>
+              <w:bottom w:type="dxa" w:w="80"/>
+              <w:right w:type="dxa" w:w="120"/>
+            </w:tcMar>
+          </w:tcPr>
+          <w:p>
+            <w:pPr>
+              <w:spacing w:after="0" w:before="0"/>
+            </w:pPr>
+            <w:r>
+              <w:rPr>
+                <w:rFonts w:ascii="Arial" w:cs="Arial" w:eastAsia="Arial" w:hAnsi="Arial"/>
+                <w:sz w:val="21"/>
+                <w:szCs w:val="21"/>
+              </w:rPr>
+              <w:t xml:space="preserve"/>
+            </w:r>
+          </w:p>
+        </w:tc>
+        <w:tc>
+          <w:tcPr>
+            <w:tcW w:type="dxa" w:w="2409"/>
+            <w:tcBorders>
+              <w:top w:val="single" w:color="BFBFBF" w:sz="4"/>
+              <w:left w:val="single" w:color="BFBFBF" w:sz="4"/>
+              <w:bottom w:val="single" w:color="BFBFBF" w:sz="4"/>
+              <w:right w:val="single" w:color="BFBFBF" w:sz="4"/>
+            </w:tcBorders>
+            <w:tcMar>
+              <w:top w:type="dxa" w:w="80"/>
+              <w:left w:type="dxa" w:w="120"/>
+              <w:bottom w:type="dxa" w:w="80"/>
+              <w:right w:type="dxa" w:w="120"/>
+            </w:tcMar>
+          </w:tcPr>
+          <w:p>
+            <w:pPr>
+              <w:spacing w:after="0" w:before="0"/>
+            </w:pPr>
+            <w:r>
+              <w:rPr>
+                <w:rFonts w:ascii="Arial" w:cs="Arial" w:eastAsia="Arial" w:hAnsi="Arial"/>
+                <w:sz w:val="21"/>
+                <w:szCs w:val="21"/>
+              </w:rPr>
+              <w:t xml:space="preserve"/>
+            </w:r>
+          </w:p>
+        </w:tc>
+        <w:tc>
+          <w:tcPr>
+            <w:tcW w:type="dxa" w:w="2410"/>
             <w:tcBorders>
               <w:top w:val="single" w:color="BFBFBF" w:sz="4"/>
               <w:left w:val="single" w:color="BFBFBF" w:sz="4"/>
@@ -1799,274 +3117,71 @@
       <w:tr>
         <w:trPr>
           <w:cantSplit/>
-          <w:trHeight w:val="520" w:hRule="atLeast"/>
+          <w:trHeight w:val="460" w:hRule="atLeast"/>
         </w:trPr>
         <w:tc>
           <w:tcPr>
-            <w:tcW w:type="dxa" w:w="3470"/>
-            <w:tcBorders>
-              <w:top w:val="single" w:color="BFBFBF" w:sz="4"/>
-              <w:left w:val="single" w:color="BFBFBF" w:sz="4"/>
-              <w:bottom w:val="single" w:color="BFBFBF" w:sz="4"/>
-              <w:right w:val="single" w:color="BFBFBF" w:sz="4"/>
-            </w:tcBorders>
-            <w:shd w:fill="F2F2F2" w:color="auto" w:val="clear"/>
-            <w:tcMar>
-              <w:top w:type="dxa" w:w="80"/>
-              <w:left w:type="dxa" w:w="120"/>
-              <w:bottom w:type="dxa" w:w="80"/>
-              <w:right w:type="dxa" w:w="120"/>
-            </w:tcMar>
-          </w:tcPr>
-          <w:p>
-            <w:pPr>
-              <w:spacing w:after="0" w:before="0"/>
-            </w:pPr>
-            <w:r>
-              <w:rPr>
-                <w:rFonts w:ascii="Arial" w:cs="Arial" w:eastAsia="Arial" w:hAnsi="Arial"/>
-                <w:color w:val="6F6F6F"/>
-                <w:sz w:val="18"/>
-                <w:szCs w:val="18"/>
-              </w:rPr>
-              <w:t xml:space="preserve">Google rating and number of reviews</w:t>
-            </w:r>
-          </w:p>
-        </w:tc>
-        <w:tc>
-          <w:tcPr>
-            <w:tcW w:type="dxa" w:w="6168"/>
-            <w:tcBorders>
-              <w:top w:val="single" w:color="BFBFBF" w:sz="4"/>
-              <w:left w:val="single" w:color="BFBFBF" w:sz="4"/>
-              <w:bottom w:val="single" w:color="BFBFBF" w:sz="4"/>
-              <w:right w:val="single" w:color="BFBFBF" w:sz="4"/>
-            </w:tcBorders>
-            <w:tcMar>
-              <w:top w:type="dxa" w:w="80"/>
-              <w:left w:type="dxa" w:w="120"/>
-              <w:bottom w:type="dxa" w:w="80"/>
-              <w:right w:type="dxa" w:w="120"/>
-            </w:tcMar>
-          </w:tcPr>
-          <w:p>
-            <w:pPr>
-              <w:spacing w:after="0" w:before="0"/>
-            </w:pPr>
-            <w:r>
-              <w:rPr>
-                <w:rFonts w:ascii="Arial" w:cs="Arial" w:eastAsia="Arial" w:hAnsi="Arial"/>
-                <w:sz w:val="21"/>
-                <w:szCs w:val="21"/>
-              </w:rPr>
-              <w:t xml:space="preserve"/>
-            </w:r>
-          </w:p>
-        </w:tc>
-      </w:tr>
-      <w:tr>
-        <w:trPr>
-          <w:cantSplit/>
-          <w:trHeight w:val="520" w:hRule="atLeast"/>
-        </w:trPr>
-        <w:tc>
-          <w:tcPr>
-            <w:tcW w:type="dxa" w:w="3470"/>
-            <w:tcBorders>
-              <w:top w:val="single" w:color="BFBFBF" w:sz="4"/>
-              <w:left w:val="single" w:color="BFBFBF" w:sz="4"/>
-              <w:bottom w:val="single" w:color="BFBFBF" w:sz="4"/>
-              <w:right w:val="single" w:color="BFBFBF" w:sz="4"/>
-            </w:tcBorders>
-            <w:shd w:fill="F2F2F2" w:color="auto" w:val="clear"/>
-            <w:tcMar>
-              <w:top w:type="dxa" w:w="80"/>
-              <w:left w:type="dxa" w:w="120"/>
-              <w:bottom w:type="dxa" w:w="80"/>
-              <w:right w:type="dxa" w:w="120"/>
-            </w:tcMar>
-          </w:tcPr>
-          <w:p>
-            <w:pPr>
-              <w:spacing w:after="0" w:before="0"/>
-            </w:pPr>
-            <w:r>
-              <w:rPr>
-                <w:rFonts w:ascii="Arial" w:cs="Arial" w:eastAsia="Arial" w:hAnsi="Arial"/>
-                <w:color w:val="6F6F6F"/>
-                <w:sz w:val="18"/>
-                <w:szCs w:val="18"/>
-              </w:rPr>
-              <w:t xml:space="preserve">Followers on your main account</w:t>
-            </w:r>
-          </w:p>
-        </w:tc>
-        <w:tc>
-          <w:tcPr>
-            <w:tcW w:type="dxa" w:w="6168"/>
-            <w:tcBorders>
-              <w:top w:val="single" w:color="BFBFBF" w:sz="4"/>
-              <w:left w:val="single" w:color="BFBFBF" w:sz="4"/>
-              <w:bottom w:val="single" w:color="BFBFBF" w:sz="4"/>
-              <w:right w:val="single" w:color="BFBFBF" w:sz="4"/>
-            </w:tcBorders>
-            <w:tcMar>
-              <w:top w:type="dxa" w:w="80"/>
-              <w:left w:type="dxa" w:w="120"/>
-              <w:bottom w:type="dxa" w:w="80"/>
-              <w:right w:type="dxa" w:w="120"/>
-            </w:tcMar>
-          </w:tcPr>
-          <w:p>
-            <w:pPr>
-              <w:spacing w:after="0" w:before="0"/>
-            </w:pPr>
-            <w:r>
-              <w:rPr>
-                <w:rFonts w:ascii="Arial" w:cs="Arial" w:eastAsia="Arial" w:hAnsi="Arial"/>
-                <w:sz w:val="21"/>
-                <w:szCs w:val="21"/>
-              </w:rPr>
-              <w:t xml:space="preserve"/>
-            </w:r>
-          </w:p>
-        </w:tc>
-      </w:tr>
-      <w:tr>
-        <w:trPr>
-          <w:cantSplit/>
-          <w:trHeight w:val="520" w:hRule="atLeast"/>
-        </w:trPr>
-        <w:tc>
-          <w:tcPr>
-            <w:tcW w:type="dxa" w:w="3470"/>
-            <w:tcBorders>
-              <w:top w:val="single" w:color="BFBFBF" w:sz="4"/>
-              <w:left w:val="single" w:color="BFBFBF" w:sz="4"/>
-              <w:bottom w:val="single" w:color="BFBFBF" w:sz="4"/>
-              <w:right w:val="single" w:color="BFBFBF" w:sz="4"/>
-            </w:tcBorders>
-            <w:shd w:fill="F2F2F2" w:color="auto" w:val="clear"/>
-            <w:tcMar>
-              <w:top w:type="dxa" w:w="80"/>
-              <w:left w:type="dxa" w:w="120"/>
-              <w:bottom w:type="dxa" w:w="80"/>
-              <w:right w:type="dxa" w:w="120"/>
-            </w:tcMar>
-          </w:tcPr>
-          <w:p>
-            <w:pPr>
-              <w:spacing w:after="0" w:before="0"/>
-            </w:pPr>
-            <w:r>
-              <w:rPr>
-                <w:rFonts w:ascii="Arial" w:cs="Arial" w:eastAsia="Arial" w:hAnsi="Arial"/>
-                <w:color w:val="6F6F6F"/>
-                <w:sz w:val="18"/>
-                <w:szCs w:val="18"/>
-              </w:rPr>
-              <w:t xml:space="preserve">Monthly ad spend, if any</w:t>
-            </w:r>
-          </w:p>
-        </w:tc>
-        <w:tc>
-          <w:tcPr>
-            <w:tcW w:type="dxa" w:w="6168"/>
-            <w:tcBorders>
-              <w:top w:val="single" w:color="BFBFBF" w:sz="4"/>
-              <w:left w:val="single" w:color="BFBFBF" w:sz="4"/>
-              <w:bottom w:val="single" w:color="BFBFBF" w:sz="4"/>
-              <w:right w:val="single" w:color="BFBFBF" w:sz="4"/>
-            </w:tcBorders>
-            <w:tcMar>
-              <w:top w:type="dxa" w:w="80"/>
-              <w:left w:type="dxa" w:w="120"/>
-              <w:bottom w:type="dxa" w:w="80"/>
-              <w:right w:type="dxa" w:w="120"/>
-            </w:tcMar>
-          </w:tcPr>
-          <w:p>
-            <w:pPr>
-              <w:spacing w:after="0" w:before="0"/>
-            </w:pPr>
-            <w:r>
-              <w:rPr>
-                <w:rFonts w:ascii="Arial" w:cs="Arial" w:eastAsia="Arial" w:hAnsi="Arial"/>
-                <w:sz w:val="21"/>
-                <w:szCs w:val="21"/>
-              </w:rPr>
-              <w:t xml:space="preserve"/>
-            </w:r>
-          </w:p>
-        </w:tc>
-      </w:tr>
-    </w:tbl>
-    <w:p>
-      <w:pPr>
-        <w:keepNext/>
-        <w:spacing w:after="60" w:before="280"/>
-      </w:pPr>
-      <w:r>
-        <w:rPr>
-          <w:rFonts w:ascii="Arial" w:cs="Arial" w:eastAsia="Arial" w:hAnsi="Arial"/>
-          <w:b/>
-          <w:bCs/>
-          <w:sz w:val="22"/>
-          <w:szCs w:val="22"/>
-        </w:rPr>
-        <w:t xml:space="preserve">7.  </w:t>
-      </w:r>
-      <w:r>
-        <w:rPr>
-          <w:rFonts w:ascii="Arial" w:cs="Arial" w:eastAsia="Arial" w:hAnsi="Arial"/>
-          <w:b/>
-          <w:bCs/>
-          <w:sz w:val="22"/>
-          <w:szCs w:val="22"/>
-        </w:rPr>
-        <w:t xml:space="preserve">What's the biggest thing holding your marketing back right now?</w:t>
-      </w:r>
-    </w:p>
-    <w:p>
-      <w:pPr>
-        <w:keepNext/>
-        <w:spacing w:after="80" w:before="0"/>
-      </w:pPr>
-      <w:r>
-        <w:rPr>
-          <w:rFonts w:ascii="Arial" w:cs="Arial" w:eastAsia="Arial" w:hAnsi="Arial"/>
-          <w:i/>
-          <w:iCs/>
-          <w:color w:val="9A9A9A"/>
-          <w:sz w:val="18"/>
-          <w:szCs w:val="18"/>
-        </w:rPr>
-        <w:t xml:space="preserve">e.g. Time. We post in bursts, then disappear for a month.</w:t>
-      </w:r>
-    </w:p>
-    <w:tbl>
-      <w:tblPr>
-        <w:tblW w:type="dxa" w:w="9638"/>
-        <w:tblBorders>
-          <w:top w:val="single" w:color="auto" w:sz="4"/>
-          <w:left w:val="single" w:color="auto" w:sz="4"/>
-          <w:bottom w:val="single" w:color="auto" w:sz="4"/>
-          <w:right w:val="single" w:color="auto" w:sz="4"/>
-          <w:insideH w:val="single" w:color="auto" w:sz="4"/>
-          <w:insideV w:val="single" w:color="auto" w:sz="4"/>
-        </w:tblBorders>
-      </w:tblPr>
-      <w:tblGrid>
-        <w:gridCol w:w="9638"/>
-      </w:tblGrid>
-      <w:tr>
-        <w:trPr>
-          <w:cantSplit/>
-          <w:trHeight w:val="1300" w:hRule="atLeast"/>
-        </w:trPr>
-        <w:tc>
-          <w:tcPr>
-            <w:tcW w:type="dxa" w:w="9638"/>
+            <w:tcW w:type="dxa" w:w="4819"/>
+            <w:tcBorders>
+              <w:top w:val="single" w:color="BFBFBF" w:sz="4"/>
+              <w:left w:val="single" w:color="BFBFBF" w:sz="4"/>
+              <w:bottom w:val="single" w:color="BFBFBF" w:sz="4"/>
+              <w:right w:val="single" w:color="BFBFBF" w:sz="4"/>
+            </w:tcBorders>
+            <w:tcMar>
+              <w:top w:type="dxa" w:w="80"/>
+              <w:left w:type="dxa" w:w="120"/>
+              <w:bottom w:type="dxa" w:w="80"/>
+              <w:right w:type="dxa" w:w="120"/>
+            </w:tcMar>
+          </w:tcPr>
+          <w:p>
+            <w:pPr>
+              <w:spacing w:after="0" w:before="0"/>
+            </w:pPr>
+            <w:r>
+              <w:rPr>
+                <w:rFonts w:ascii="Arial" w:cs="Arial" w:eastAsia="Arial" w:hAnsi="Arial"/>
+                <w:sz w:val="21"/>
+                <w:szCs w:val="21"/>
+              </w:rPr>
+              <w:t xml:space="preserve"/>
+            </w:r>
+          </w:p>
+        </w:tc>
+        <w:tc>
+          <w:tcPr>
+            <w:tcW w:type="dxa" w:w="2409"/>
+            <w:tcBorders>
+              <w:top w:val="single" w:color="BFBFBF" w:sz="4"/>
+              <w:left w:val="single" w:color="BFBFBF" w:sz="4"/>
+              <w:bottom w:val="single" w:color="BFBFBF" w:sz="4"/>
+              <w:right w:val="single" w:color="BFBFBF" w:sz="4"/>
+            </w:tcBorders>
+            <w:tcMar>
+              <w:top w:type="dxa" w:w="80"/>
+              <w:left w:type="dxa" w:w="120"/>
+              <w:bottom w:type="dxa" w:w="80"/>
+              <w:right w:type="dxa" w:w="120"/>
+            </w:tcMar>
+          </w:tcPr>
+          <w:p>
+            <w:pPr>
+              <w:spacing w:after="0" w:before="0"/>
+            </w:pPr>
+            <w:r>
+              <w:rPr>
+                <w:rFonts w:ascii="Arial" w:cs="Arial" w:eastAsia="Arial" w:hAnsi="Arial"/>
+                <w:sz w:val="21"/>
+                <w:szCs w:val="21"/>
+              </w:rPr>
+              <w:t xml:space="preserve"/>
+            </w:r>
+          </w:p>
+        </w:tc>
+        <w:tc>
+          <w:tcPr>
+            <w:tcW w:type="dxa" w:w="2410"/>
             <w:tcBorders>
               <w:top w:val="single" w:color="BFBFBF" w:sz="4"/>
               <w:left w:val="single" w:color="BFBFBF" w:sz="4"/>
@@ -2164,7 +3279,75 @@
                 <w:sz w:val="18"/>
                 <w:szCs w:val="18"/>
               </w:rPr>
-              <w:t xml:space="preserve">What have you tried before that didn't work, and why do you think it didn't?</w:t>
+              <w:t xml:space="preserve">Health fund rebates, packages, memberships or gift cards?</w:t>
+            </w:r>
+          </w:p>
+        </w:tc>
+        <w:tc>
+          <w:tcPr>
+            <w:tcW w:type="dxa" w:w="6168"/>
+            <w:tcBorders>
+              <w:top w:val="single" w:color="BFBFBF" w:sz="4"/>
+              <w:left w:val="single" w:color="BFBFBF" w:sz="4"/>
+              <w:bottom w:val="single" w:color="BFBFBF" w:sz="4"/>
+              <w:right w:val="single" w:color="BFBFBF" w:sz="4"/>
+            </w:tcBorders>
+            <w:tcMar>
+              <w:top w:type="dxa" w:w="80"/>
+              <w:left w:type="dxa" w:w="120"/>
+              <w:bottom w:type="dxa" w:w="80"/>
+              <w:right w:type="dxa" w:w="120"/>
+            </w:tcMar>
+          </w:tcPr>
+          <w:p>
+            <w:pPr>
+              <w:spacing w:after="0" w:before="0"/>
+            </w:pPr>
+            <w:r>
+              <w:rPr>
+                <w:rFonts w:ascii="Arial" w:cs="Arial" w:eastAsia="Arial" w:hAnsi="Arial"/>
+                <w:sz w:val="21"/>
+                <w:szCs w:val="21"/>
+              </w:rPr>
+              <w:t xml:space="preserve"/>
+            </w:r>
+          </w:p>
+        </w:tc>
+      </w:tr>
+      <w:tr>
+        <w:trPr>
+          <w:cantSplit/>
+          <w:trHeight w:val="700" w:hRule="atLeast"/>
+        </w:trPr>
+        <w:tc>
+          <w:tcPr>
+            <w:tcW w:type="dxa" w:w="3470"/>
+            <w:tcBorders>
+              <w:top w:val="single" w:color="BFBFBF" w:sz="4"/>
+              <w:left w:val="single" w:color="BFBFBF" w:sz="4"/>
+              <w:bottom w:val="single" w:color="BFBFBF" w:sz="4"/>
+              <w:right w:val="single" w:color="BFBFBF" w:sz="4"/>
+            </w:tcBorders>
+            <w:shd w:fill="F2F2F2" w:color="auto" w:val="clear"/>
+            <w:tcMar>
+              <w:top w:type="dxa" w:w="80"/>
+              <w:left w:type="dxa" w:w="120"/>
+              <w:bottom w:type="dxa" w:w="80"/>
+              <w:right w:type="dxa" w:w="120"/>
+            </w:tcMar>
+          </w:tcPr>
+          <w:p>
+            <w:pPr>
+              <w:spacing w:after="0" w:before="0"/>
+            </w:pPr>
+            <w:r>
+              <w:rPr>
+                <w:rFonts w:ascii="Arial" w:cs="Arial" w:eastAsia="Arial" w:hAnsi="Arial"/>
+                <w:color w:val="6F6F6F"/>
+                <w:sz w:val="18"/>
+                <w:szCs w:val="18"/>
+              </w:rPr>
+              <w:t xml:space="preserve">Roughly what does a customer spend, and how often do they come back?</w:t>
             </w:r>
           </w:p>
         </w:tc>
@@ -2213,7 +3396,7 @@
           <w:sz w:val="22"/>
           <w:szCs w:val="22"/>
         </w:rPr>
-        <w:t xml:space="preserve">8.  </w:t>
+        <w:t xml:space="preserve">11.  </w:t>
       </w:r>
       <w:r>
         <w:rPr>
@@ -2223,7 +3406,7 @@
           <w:sz w:val="22"/>
           <w:szCs w:val="22"/>
         </w:rPr>
-        <w:t xml:space="preserve">When are your busy and quiet times of year?</w:t>
+        <w:t xml:space="preserve">Any deals or specials coming up?</w:t>
       </w:r>
     </w:p>
     <w:p>
@@ -2238,7 +3421,7 @@
           <w:sz w:val="19"/>
           <w:szCs w:val="19"/>
         </w:rPr>
-        <w:t xml:space="preserve">We'll plan your months around them.</w:t>
+        <w:t xml:space="preserve">Include the price, start and end dates, and any fine print. None right now? Just skip.</w:t>
       </w:r>
     </w:p>
     <w:p>
@@ -2255,7 +3438,7 @@
           <w:sz w:val="18"/>
           <w:szCs w:val="18"/>
         </w:rPr>
-        <w:t xml:space="preserve">e.g. January is dead. June to August is flat out with winter sport injuries.</w:t>
+        <w:t xml:space="preserve">e.g. $20 off your first visit, 1 to 30 November, new clients only</w:t>
       </w:r>
     </w:p>
     <w:tbl>
@@ -2313,138 +3496,6 @@
     <w:p>
       <w:pPr>
         <w:keepNext/>
-        <w:spacing w:after="80" w:before="160"/>
-      </w:pPr>
-      <w:r>
-        <w:rPr>
-          <w:rFonts w:ascii="Arial" w:cs="Arial" w:eastAsia="Arial" w:hAnsi="Arial"/>
-          <w:b/>
-          <w:bCs/>
-          <w:caps/>
-          <w:color w:val="6F6F6F"/>
-          <w:spacing w:val="20"/>
-          <w:sz w:val="16"/>
-          <w:szCs w:val="16"/>
-        </w:rPr>
-        <w:t xml:space="preserve">Got more to say? Optional</w:t>
-      </w:r>
-    </w:p>
-    <w:tbl>
-      <w:tblPr>
-        <w:tblW w:type="dxa" w:w="9638"/>
-        <w:tblBorders>
-          <w:top w:val="single" w:color="auto" w:sz="4"/>
-          <w:left w:val="single" w:color="auto" w:sz="4"/>
-          <w:bottom w:val="single" w:color="auto" w:sz="4"/>
-          <w:right w:val="single" w:color="auto" w:sz="4"/>
-          <w:insideH w:val="single" w:color="auto" w:sz="4"/>
-          <w:insideV w:val="single" w:color="auto" w:sz="4"/>
-        </w:tblBorders>
-      </w:tblPr>
-      <w:tblGrid>
-        <w:gridCol w:w="3470"/>
-        <w:gridCol w:w="6168"/>
-      </w:tblGrid>
-      <w:tr>
-        <w:trPr>
-          <w:cantSplit/>
-          <w:trHeight w:val="700" w:hRule="atLeast"/>
-        </w:trPr>
-        <w:tc>
-          <w:tcPr>
-            <w:tcW w:type="dxa" w:w="3470"/>
-            <w:tcBorders>
-              <w:top w:val="single" w:color="BFBFBF" w:sz="4"/>
-              <w:left w:val="single" w:color="BFBFBF" w:sz="4"/>
-              <w:bottom w:val="single" w:color="BFBFBF" w:sz="4"/>
-              <w:right w:val="single" w:color="BFBFBF" w:sz="4"/>
-            </w:tcBorders>
-            <w:shd w:fill="F2F2F2" w:color="auto" w:val="clear"/>
-            <w:tcMar>
-              <w:top w:type="dxa" w:w="80"/>
-              <w:left w:type="dxa" w:w="120"/>
-              <w:bottom w:type="dxa" w:w="80"/>
-              <w:right w:type="dxa" w:w="120"/>
-            </w:tcMar>
-          </w:tcPr>
-          <w:p>
-            <w:pPr>
-              <w:spacing w:after="0" w:before="0"/>
-            </w:pPr>
-            <w:r>
-              <w:rPr>
-                <w:rFonts w:ascii="Arial" w:cs="Arial" w:eastAsia="Arial" w:hAnsi="Arial"/>
-                <w:color w:val="6F6F6F"/>
-                <w:sz w:val="18"/>
-                <w:szCs w:val="18"/>
-              </w:rPr>
-              <w:t xml:space="preserve">Launches, events, anniversaries or big dates coming up</w:t>
-            </w:r>
-          </w:p>
-        </w:tc>
-        <w:tc>
-          <w:tcPr>
-            <w:tcW w:type="dxa" w:w="6168"/>
-            <w:tcBorders>
-              <w:top w:val="single" w:color="BFBFBF" w:sz="4"/>
-              <w:left w:val="single" w:color="BFBFBF" w:sz="4"/>
-              <w:bottom w:val="single" w:color="BFBFBF" w:sz="4"/>
-              <w:right w:val="single" w:color="BFBFBF" w:sz="4"/>
-            </w:tcBorders>
-            <w:tcMar>
-              <w:top w:type="dxa" w:w="80"/>
-              <w:left w:type="dxa" w:w="120"/>
-              <w:bottom w:type="dxa" w:w="80"/>
-              <w:right w:type="dxa" w:w="120"/>
-            </w:tcMar>
-          </w:tcPr>
-          <w:p>
-            <w:pPr>
-              <w:spacing w:after="0" w:before="0"/>
-            </w:pPr>
-            <w:r>
-              <w:rPr>
-                <w:rFonts w:ascii="Arial" w:cs="Arial" w:eastAsia="Arial" w:hAnsi="Arial"/>
-                <w:sz w:val="21"/>
-                <w:szCs w:val="21"/>
-              </w:rPr>
-              <w:t xml:space="preserve"/>
-            </w:r>
-          </w:p>
-        </w:tc>
-      </w:tr>
-    </w:tbl>
-    <w:p>
-      <w:pPr>
-        <w:keepNext/>
-        <w:pBdr>
-          <w:bottom w:val="single" w:color="111111" w:sz="12" w:space="6"/>
-        </w:pBdr>
-        <w:spacing w:after="80" w:before="480"/>
-      </w:pPr>
-      <w:r>
-        <w:rPr>
-          <w:rFonts w:ascii="Arial" w:cs="Arial" w:eastAsia="Arial" w:hAnsi="Arial"/>
-          <w:color w:val="6F6F6F"/>
-          <w:sz w:val="20"/>
-          <w:szCs w:val="20"/>
-        </w:rPr>
-        <w:t xml:space="preserve">03   </w:t>
-      </w:r>
-      <w:r>
-        <w:rPr>
-          <w:rFonts w:ascii="Arial" w:cs="Arial" w:eastAsia="Arial" w:hAnsi="Arial"/>
-          <w:b/>
-          <w:bCs/>
-          <w:sz w:val="32"/>
-          <w:szCs w:val="32"/>
-        </w:rPr>
-        <w:t xml:space="preserve">Your Prices</w:t>
-      </w:r>
-    </w:p>
-    <w:p>
-      <w:pPr>
-        <w:keepNext/>
         <w:spacing w:after="60" w:before="280"/>
       </w:pPr>
       <w:r>
@@ -2455,7 +3506,7 @@
           <w:sz w:val="22"/>
           <w:szCs w:val="22"/>
         </w:rPr>
-        <w:t xml:space="preserve">9.  </w:t>
+        <w:t xml:space="preserve">12.  </w:t>
       </w:r>
       <w:r>
         <w:rPr>
@@ -2465,837 +3516,7 @@
           <w:sz w:val="22"/>
           <w:szCs w:val="22"/>
         </w:rPr>
-        <w:t xml:space="preserve">What do you sell, and what does it cost?</w:t>
-      </w:r>
-    </w:p>
-    <w:p>
-      <w:pPr>
-        <w:keepNext/>
-        <w:spacing w:after="80" w:before="0"/>
-      </w:pPr>
-      <w:r>
-        <w:rPr>
-          <w:rFonts w:ascii="Arial" w:cs="Arial" w:eastAsia="Arial" w:hAnsi="Arial"/>
-          <w:color w:val="6F6F6F"/>
-          <w:sz w:val="19"/>
-          <w:szCs w:val="19"/>
-        </w:rPr>
-        <w:t xml:space="preserve">Real prices only. One line per service or product. We never make up a price.</w:t>
-      </w:r>
-    </w:p>
-    <w:tbl>
-      <w:tblPr>
-        <w:tblW w:type="dxa" w:w="9638"/>
-        <w:tblBorders>
-          <w:top w:val="single" w:color="auto" w:sz="4"/>
-          <w:left w:val="single" w:color="auto" w:sz="4"/>
-          <w:bottom w:val="single" w:color="auto" w:sz="4"/>
-          <w:right w:val="single" w:color="auto" w:sz="4"/>
-          <w:insideH w:val="single" w:color="auto" w:sz="4"/>
-          <w:insideV w:val="single" w:color="auto" w:sz="4"/>
-        </w:tblBorders>
-      </w:tblPr>
-      <w:tblGrid>
-        <w:gridCol w:w="4819"/>
-        <w:gridCol w:w="2409"/>
-        <w:gridCol w:w="2410"/>
-      </w:tblGrid>
-      <w:tr>
-        <w:trPr>
-          <w:tblHeader/>
-        </w:trPr>
-        <w:tc>
-          <w:tcPr>
-            <w:tcW w:type="dxa" w:w="4819"/>
-            <w:tcBorders>
-              <w:top w:val="single" w:color="BFBFBF" w:sz="4"/>
-              <w:left w:val="single" w:color="BFBFBF" w:sz="4"/>
-              <w:bottom w:val="single" w:color="BFBFBF" w:sz="4"/>
-              <w:right w:val="single" w:color="BFBFBF" w:sz="4"/>
-            </w:tcBorders>
-            <w:shd w:fill="F2F2F2" w:color="auto" w:val="clear"/>
-            <w:tcMar>
-              <w:top w:type="dxa" w:w="80"/>
-              <w:left w:type="dxa" w:w="120"/>
-              <w:bottom w:type="dxa" w:w="80"/>
-              <w:right w:type="dxa" w:w="120"/>
-            </w:tcMar>
-          </w:tcPr>
-          <w:p>
-            <w:pPr>
-              <w:spacing w:after="0" w:before="0"/>
-            </w:pPr>
-            <w:r>
-              <w:rPr>
-                <w:rFonts w:ascii="Arial" w:cs="Arial" w:eastAsia="Arial" w:hAnsi="Arial"/>
-                <w:b/>
-                <w:bCs/>
-                <w:sz w:val="18"/>
-                <w:szCs w:val="18"/>
-              </w:rPr>
-              <w:t xml:space="preserve">Service or product</w:t>
-            </w:r>
-          </w:p>
-        </w:tc>
-        <w:tc>
-          <w:tcPr>
-            <w:tcW w:type="dxa" w:w="2409"/>
-            <w:tcBorders>
-              <w:top w:val="single" w:color="BFBFBF" w:sz="4"/>
-              <w:left w:val="single" w:color="BFBFBF" w:sz="4"/>
-              <w:bottom w:val="single" w:color="BFBFBF" w:sz="4"/>
-              <w:right w:val="single" w:color="BFBFBF" w:sz="4"/>
-            </w:tcBorders>
-            <w:shd w:fill="F2F2F2" w:color="auto" w:val="clear"/>
-            <w:tcMar>
-              <w:top w:type="dxa" w:w="80"/>
-              <w:left w:type="dxa" w:w="120"/>
-              <w:bottom w:type="dxa" w:w="80"/>
-              <w:right w:type="dxa" w:w="120"/>
-            </w:tcMar>
-          </w:tcPr>
-          <w:p>
-            <w:pPr>
-              <w:spacing w:after="0" w:before="0"/>
-            </w:pPr>
-            <w:r>
-              <w:rPr>
-                <w:rFonts w:ascii="Arial" w:cs="Arial" w:eastAsia="Arial" w:hAnsi="Arial"/>
-                <w:b/>
-                <w:bCs/>
-                <w:sz w:val="18"/>
-                <w:szCs w:val="18"/>
-              </w:rPr>
-              <w:t xml:space="preserve">Price ($)</w:t>
-            </w:r>
-          </w:p>
-        </w:tc>
-        <w:tc>
-          <w:tcPr>
-            <w:tcW w:type="dxa" w:w="2410"/>
-            <w:tcBorders>
-              <w:top w:val="single" w:color="BFBFBF" w:sz="4"/>
-              <w:left w:val="single" w:color="BFBFBF" w:sz="4"/>
-              <w:bottom w:val="single" w:color="BFBFBF" w:sz="4"/>
-              <w:right w:val="single" w:color="BFBFBF" w:sz="4"/>
-            </w:tcBorders>
-            <w:shd w:fill="F2F2F2" w:color="auto" w:val="clear"/>
-            <w:tcMar>
-              <w:top w:type="dxa" w:w="80"/>
-              <w:left w:type="dxa" w:w="120"/>
-              <w:bottom w:type="dxa" w:w="80"/>
-              <w:right w:type="dxa" w:w="120"/>
-            </w:tcMar>
-          </w:tcPr>
-          <w:p>
-            <w:pPr>
-              <w:spacing w:after="0" w:before="0"/>
-            </w:pPr>
-            <w:r>
-              <w:rPr>
-                <w:rFonts w:ascii="Arial" w:cs="Arial" w:eastAsia="Arial" w:hAnsi="Arial"/>
-                <w:b/>
-                <w:bCs/>
-                <w:sz w:val="18"/>
-                <w:szCs w:val="18"/>
-              </w:rPr>
-              <w:t xml:space="preserve">Length or size</w:t>
-            </w:r>
-          </w:p>
-        </w:tc>
-      </w:tr>
-      <w:tr>
-        <w:trPr>
-          <w:cantSplit/>
-          <w:trHeight w:val="460" w:hRule="atLeast"/>
-        </w:trPr>
-        <w:tc>
-          <w:tcPr>
-            <w:tcW w:type="dxa" w:w="4819"/>
-            <w:tcBorders>
-              <w:top w:val="single" w:color="BFBFBF" w:sz="4"/>
-              <w:left w:val="single" w:color="BFBFBF" w:sz="4"/>
-              <w:bottom w:val="single" w:color="BFBFBF" w:sz="4"/>
-              <w:right w:val="single" w:color="BFBFBF" w:sz="4"/>
-            </w:tcBorders>
-            <w:tcMar>
-              <w:top w:type="dxa" w:w="80"/>
-              <w:left w:type="dxa" w:w="120"/>
-              <w:bottom w:type="dxa" w:w="80"/>
-              <w:right w:type="dxa" w:w="120"/>
-            </w:tcMar>
-          </w:tcPr>
-          <w:p>
-            <w:pPr>
-              <w:spacing w:after="0" w:before="0"/>
-            </w:pPr>
-            <w:r>
-              <w:rPr>
-                <w:rFonts w:ascii="Arial" w:cs="Arial" w:eastAsia="Arial" w:hAnsi="Arial"/>
-                <w:sz w:val="21"/>
-                <w:szCs w:val="21"/>
-              </w:rPr>
-              <w:t xml:space="preserve"/>
-            </w:r>
-          </w:p>
-        </w:tc>
-        <w:tc>
-          <w:tcPr>
-            <w:tcW w:type="dxa" w:w="2409"/>
-            <w:tcBorders>
-              <w:top w:val="single" w:color="BFBFBF" w:sz="4"/>
-              <w:left w:val="single" w:color="BFBFBF" w:sz="4"/>
-              <w:bottom w:val="single" w:color="BFBFBF" w:sz="4"/>
-              <w:right w:val="single" w:color="BFBFBF" w:sz="4"/>
-            </w:tcBorders>
-            <w:tcMar>
-              <w:top w:type="dxa" w:w="80"/>
-              <w:left w:type="dxa" w:w="120"/>
-              <w:bottom w:type="dxa" w:w="80"/>
-              <w:right w:type="dxa" w:w="120"/>
-            </w:tcMar>
-          </w:tcPr>
-          <w:p>
-            <w:pPr>
-              <w:spacing w:after="0" w:before="0"/>
-            </w:pPr>
-            <w:r>
-              <w:rPr>
-                <w:rFonts w:ascii="Arial" w:cs="Arial" w:eastAsia="Arial" w:hAnsi="Arial"/>
-                <w:sz w:val="21"/>
-                <w:szCs w:val="21"/>
-              </w:rPr>
-              <w:t xml:space="preserve"/>
-            </w:r>
-          </w:p>
-        </w:tc>
-        <w:tc>
-          <w:tcPr>
-            <w:tcW w:type="dxa" w:w="2410"/>
-            <w:tcBorders>
-              <w:top w:val="single" w:color="BFBFBF" w:sz="4"/>
-              <w:left w:val="single" w:color="BFBFBF" w:sz="4"/>
-              <w:bottom w:val="single" w:color="BFBFBF" w:sz="4"/>
-              <w:right w:val="single" w:color="BFBFBF" w:sz="4"/>
-            </w:tcBorders>
-            <w:tcMar>
-              <w:top w:type="dxa" w:w="80"/>
-              <w:left w:type="dxa" w:w="120"/>
-              <w:bottom w:type="dxa" w:w="80"/>
-              <w:right w:type="dxa" w:w="120"/>
-            </w:tcMar>
-          </w:tcPr>
-          <w:p>
-            <w:pPr>
-              <w:spacing w:after="0" w:before="0"/>
-            </w:pPr>
-            <w:r>
-              <w:rPr>
-                <w:rFonts w:ascii="Arial" w:cs="Arial" w:eastAsia="Arial" w:hAnsi="Arial"/>
-                <w:sz w:val="21"/>
-                <w:szCs w:val="21"/>
-              </w:rPr>
-              <w:t xml:space="preserve"/>
-            </w:r>
-          </w:p>
-        </w:tc>
-      </w:tr>
-      <w:tr>
-        <w:trPr>
-          <w:cantSplit/>
-          <w:trHeight w:val="460" w:hRule="atLeast"/>
-        </w:trPr>
-        <w:tc>
-          <w:tcPr>
-            <w:tcW w:type="dxa" w:w="4819"/>
-            <w:tcBorders>
-              <w:top w:val="single" w:color="BFBFBF" w:sz="4"/>
-              <w:left w:val="single" w:color="BFBFBF" w:sz="4"/>
-              <w:bottom w:val="single" w:color="BFBFBF" w:sz="4"/>
-              <w:right w:val="single" w:color="BFBFBF" w:sz="4"/>
-            </w:tcBorders>
-            <w:tcMar>
-              <w:top w:type="dxa" w:w="80"/>
-              <w:left w:type="dxa" w:w="120"/>
-              <w:bottom w:type="dxa" w:w="80"/>
-              <w:right w:type="dxa" w:w="120"/>
-            </w:tcMar>
-          </w:tcPr>
-          <w:p>
-            <w:pPr>
-              <w:spacing w:after="0" w:before="0"/>
-            </w:pPr>
-            <w:r>
-              <w:rPr>
-                <w:rFonts w:ascii="Arial" w:cs="Arial" w:eastAsia="Arial" w:hAnsi="Arial"/>
-                <w:sz w:val="21"/>
-                <w:szCs w:val="21"/>
-              </w:rPr>
-              <w:t xml:space="preserve"/>
-            </w:r>
-          </w:p>
-        </w:tc>
-        <w:tc>
-          <w:tcPr>
-            <w:tcW w:type="dxa" w:w="2409"/>
-            <w:tcBorders>
-              <w:top w:val="single" w:color="BFBFBF" w:sz="4"/>
-              <w:left w:val="single" w:color="BFBFBF" w:sz="4"/>
-              <w:bottom w:val="single" w:color="BFBFBF" w:sz="4"/>
-              <w:right w:val="single" w:color="BFBFBF" w:sz="4"/>
-            </w:tcBorders>
-            <w:tcMar>
-              <w:top w:type="dxa" w:w="80"/>
-              <w:left w:type="dxa" w:w="120"/>
-              <w:bottom w:type="dxa" w:w="80"/>
-              <w:right w:type="dxa" w:w="120"/>
-            </w:tcMar>
-          </w:tcPr>
-          <w:p>
-            <w:pPr>
-              <w:spacing w:after="0" w:before="0"/>
-            </w:pPr>
-            <w:r>
-              <w:rPr>
-                <w:rFonts w:ascii="Arial" w:cs="Arial" w:eastAsia="Arial" w:hAnsi="Arial"/>
-                <w:sz w:val="21"/>
-                <w:szCs w:val="21"/>
-              </w:rPr>
-              <w:t xml:space="preserve"/>
-            </w:r>
-          </w:p>
-        </w:tc>
-        <w:tc>
-          <w:tcPr>
-            <w:tcW w:type="dxa" w:w="2410"/>
-            <w:tcBorders>
-              <w:top w:val="single" w:color="BFBFBF" w:sz="4"/>
-              <w:left w:val="single" w:color="BFBFBF" w:sz="4"/>
-              <w:bottom w:val="single" w:color="BFBFBF" w:sz="4"/>
-              <w:right w:val="single" w:color="BFBFBF" w:sz="4"/>
-            </w:tcBorders>
-            <w:tcMar>
-              <w:top w:type="dxa" w:w="80"/>
-              <w:left w:type="dxa" w:w="120"/>
-              <w:bottom w:type="dxa" w:w="80"/>
-              <w:right w:type="dxa" w:w="120"/>
-            </w:tcMar>
-          </w:tcPr>
-          <w:p>
-            <w:pPr>
-              <w:spacing w:after="0" w:before="0"/>
-            </w:pPr>
-            <w:r>
-              <w:rPr>
-                <w:rFonts w:ascii="Arial" w:cs="Arial" w:eastAsia="Arial" w:hAnsi="Arial"/>
-                <w:sz w:val="21"/>
-                <w:szCs w:val="21"/>
-              </w:rPr>
-              <w:t xml:space="preserve"/>
-            </w:r>
-          </w:p>
-        </w:tc>
-      </w:tr>
-      <w:tr>
-        <w:trPr>
-          <w:cantSplit/>
-          <w:trHeight w:val="460" w:hRule="atLeast"/>
-        </w:trPr>
-        <w:tc>
-          <w:tcPr>
-            <w:tcW w:type="dxa" w:w="4819"/>
-            <w:tcBorders>
-              <w:top w:val="single" w:color="BFBFBF" w:sz="4"/>
-              <w:left w:val="single" w:color="BFBFBF" w:sz="4"/>
-              <w:bottom w:val="single" w:color="BFBFBF" w:sz="4"/>
-              <w:right w:val="single" w:color="BFBFBF" w:sz="4"/>
-            </w:tcBorders>
-            <w:tcMar>
-              <w:top w:type="dxa" w:w="80"/>
-              <w:left w:type="dxa" w:w="120"/>
-              <w:bottom w:type="dxa" w:w="80"/>
-              <w:right w:type="dxa" w:w="120"/>
-            </w:tcMar>
-          </w:tcPr>
-          <w:p>
-            <w:pPr>
-              <w:spacing w:after="0" w:before="0"/>
-            </w:pPr>
-            <w:r>
-              <w:rPr>
-                <w:rFonts w:ascii="Arial" w:cs="Arial" w:eastAsia="Arial" w:hAnsi="Arial"/>
-                <w:sz w:val="21"/>
-                <w:szCs w:val="21"/>
-              </w:rPr>
-              <w:t xml:space="preserve"/>
-            </w:r>
-          </w:p>
-        </w:tc>
-        <w:tc>
-          <w:tcPr>
-            <w:tcW w:type="dxa" w:w="2409"/>
-            <w:tcBorders>
-              <w:top w:val="single" w:color="BFBFBF" w:sz="4"/>
-              <w:left w:val="single" w:color="BFBFBF" w:sz="4"/>
-              <w:bottom w:val="single" w:color="BFBFBF" w:sz="4"/>
-              <w:right w:val="single" w:color="BFBFBF" w:sz="4"/>
-            </w:tcBorders>
-            <w:tcMar>
-              <w:top w:type="dxa" w:w="80"/>
-              <w:left w:type="dxa" w:w="120"/>
-              <w:bottom w:type="dxa" w:w="80"/>
-              <w:right w:type="dxa" w:w="120"/>
-            </w:tcMar>
-          </w:tcPr>
-          <w:p>
-            <w:pPr>
-              <w:spacing w:after="0" w:before="0"/>
-            </w:pPr>
-            <w:r>
-              <w:rPr>
-                <w:rFonts w:ascii="Arial" w:cs="Arial" w:eastAsia="Arial" w:hAnsi="Arial"/>
-                <w:sz w:val="21"/>
-                <w:szCs w:val="21"/>
-              </w:rPr>
-              <w:t xml:space="preserve"/>
-            </w:r>
-          </w:p>
-        </w:tc>
-        <w:tc>
-          <w:tcPr>
-            <w:tcW w:type="dxa" w:w="2410"/>
-            <w:tcBorders>
-              <w:top w:val="single" w:color="BFBFBF" w:sz="4"/>
-              <w:left w:val="single" w:color="BFBFBF" w:sz="4"/>
-              <w:bottom w:val="single" w:color="BFBFBF" w:sz="4"/>
-              <w:right w:val="single" w:color="BFBFBF" w:sz="4"/>
-            </w:tcBorders>
-            <w:tcMar>
-              <w:top w:type="dxa" w:w="80"/>
-              <w:left w:type="dxa" w:w="120"/>
-              <w:bottom w:type="dxa" w:w="80"/>
-              <w:right w:type="dxa" w:w="120"/>
-            </w:tcMar>
-          </w:tcPr>
-          <w:p>
-            <w:pPr>
-              <w:spacing w:after="0" w:before="0"/>
-            </w:pPr>
-            <w:r>
-              <w:rPr>
-                <w:rFonts w:ascii="Arial" w:cs="Arial" w:eastAsia="Arial" w:hAnsi="Arial"/>
-                <w:sz w:val="21"/>
-                <w:szCs w:val="21"/>
-              </w:rPr>
-              <w:t xml:space="preserve"/>
-            </w:r>
-          </w:p>
-        </w:tc>
-      </w:tr>
-      <w:tr>
-        <w:trPr>
-          <w:cantSplit/>
-          <w:trHeight w:val="460" w:hRule="atLeast"/>
-        </w:trPr>
-        <w:tc>
-          <w:tcPr>
-            <w:tcW w:type="dxa" w:w="4819"/>
-            <w:tcBorders>
-              <w:top w:val="single" w:color="BFBFBF" w:sz="4"/>
-              <w:left w:val="single" w:color="BFBFBF" w:sz="4"/>
-              <w:bottom w:val="single" w:color="BFBFBF" w:sz="4"/>
-              <w:right w:val="single" w:color="BFBFBF" w:sz="4"/>
-            </w:tcBorders>
-            <w:tcMar>
-              <w:top w:type="dxa" w:w="80"/>
-              <w:left w:type="dxa" w:w="120"/>
-              <w:bottom w:type="dxa" w:w="80"/>
-              <w:right w:type="dxa" w:w="120"/>
-            </w:tcMar>
-          </w:tcPr>
-          <w:p>
-            <w:pPr>
-              <w:spacing w:after="0" w:before="0"/>
-            </w:pPr>
-            <w:r>
-              <w:rPr>
-                <w:rFonts w:ascii="Arial" w:cs="Arial" w:eastAsia="Arial" w:hAnsi="Arial"/>
-                <w:sz w:val="21"/>
-                <w:szCs w:val="21"/>
-              </w:rPr>
-              <w:t xml:space="preserve"/>
-            </w:r>
-          </w:p>
-        </w:tc>
-        <w:tc>
-          <w:tcPr>
-            <w:tcW w:type="dxa" w:w="2409"/>
-            <w:tcBorders>
-              <w:top w:val="single" w:color="BFBFBF" w:sz="4"/>
-              <w:left w:val="single" w:color="BFBFBF" w:sz="4"/>
-              <w:bottom w:val="single" w:color="BFBFBF" w:sz="4"/>
-              <w:right w:val="single" w:color="BFBFBF" w:sz="4"/>
-            </w:tcBorders>
-            <w:tcMar>
-              <w:top w:type="dxa" w:w="80"/>
-              <w:left w:type="dxa" w:w="120"/>
-              <w:bottom w:type="dxa" w:w="80"/>
-              <w:right w:type="dxa" w:w="120"/>
-            </w:tcMar>
-          </w:tcPr>
-          <w:p>
-            <w:pPr>
-              <w:spacing w:after="0" w:before="0"/>
-            </w:pPr>
-            <w:r>
-              <w:rPr>
-                <w:rFonts w:ascii="Arial" w:cs="Arial" w:eastAsia="Arial" w:hAnsi="Arial"/>
-                <w:sz w:val="21"/>
-                <w:szCs w:val="21"/>
-              </w:rPr>
-              <w:t xml:space="preserve"/>
-            </w:r>
-          </w:p>
-        </w:tc>
-        <w:tc>
-          <w:tcPr>
-            <w:tcW w:type="dxa" w:w="2410"/>
-            <w:tcBorders>
-              <w:top w:val="single" w:color="BFBFBF" w:sz="4"/>
-              <w:left w:val="single" w:color="BFBFBF" w:sz="4"/>
-              <w:bottom w:val="single" w:color="BFBFBF" w:sz="4"/>
-              <w:right w:val="single" w:color="BFBFBF" w:sz="4"/>
-            </w:tcBorders>
-            <w:tcMar>
-              <w:top w:type="dxa" w:w="80"/>
-              <w:left w:type="dxa" w:w="120"/>
-              <w:bottom w:type="dxa" w:w="80"/>
-              <w:right w:type="dxa" w:w="120"/>
-            </w:tcMar>
-          </w:tcPr>
-          <w:p>
-            <w:pPr>
-              <w:spacing w:after="0" w:before="0"/>
-            </w:pPr>
-            <w:r>
-              <w:rPr>
-                <w:rFonts w:ascii="Arial" w:cs="Arial" w:eastAsia="Arial" w:hAnsi="Arial"/>
-                <w:sz w:val="21"/>
-                <w:szCs w:val="21"/>
-              </w:rPr>
-              <w:t xml:space="preserve"/>
-            </w:r>
-          </w:p>
-        </w:tc>
-      </w:tr>
-      <w:tr>
-        <w:trPr>
-          <w:cantSplit/>
-          <w:trHeight w:val="460" w:hRule="atLeast"/>
-        </w:trPr>
-        <w:tc>
-          <w:tcPr>
-            <w:tcW w:type="dxa" w:w="4819"/>
-            <w:tcBorders>
-              <w:top w:val="single" w:color="BFBFBF" w:sz="4"/>
-              <w:left w:val="single" w:color="BFBFBF" w:sz="4"/>
-              <w:bottom w:val="single" w:color="BFBFBF" w:sz="4"/>
-              <w:right w:val="single" w:color="BFBFBF" w:sz="4"/>
-            </w:tcBorders>
-            <w:tcMar>
-              <w:top w:type="dxa" w:w="80"/>
-              <w:left w:type="dxa" w:w="120"/>
-              <w:bottom w:type="dxa" w:w="80"/>
-              <w:right w:type="dxa" w:w="120"/>
-            </w:tcMar>
-          </w:tcPr>
-          <w:p>
-            <w:pPr>
-              <w:spacing w:after="0" w:before="0"/>
-            </w:pPr>
-            <w:r>
-              <w:rPr>
-                <w:rFonts w:ascii="Arial" w:cs="Arial" w:eastAsia="Arial" w:hAnsi="Arial"/>
-                <w:sz w:val="21"/>
-                <w:szCs w:val="21"/>
-              </w:rPr>
-              <w:t xml:space="preserve"/>
-            </w:r>
-          </w:p>
-        </w:tc>
-        <w:tc>
-          <w:tcPr>
-            <w:tcW w:type="dxa" w:w="2409"/>
-            <w:tcBorders>
-              <w:top w:val="single" w:color="BFBFBF" w:sz="4"/>
-              <w:left w:val="single" w:color="BFBFBF" w:sz="4"/>
-              <w:bottom w:val="single" w:color="BFBFBF" w:sz="4"/>
-              <w:right w:val="single" w:color="BFBFBF" w:sz="4"/>
-            </w:tcBorders>
-            <w:tcMar>
-              <w:top w:type="dxa" w:w="80"/>
-              <w:left w:type="dxa" w:w="120"/>
-              <w:bottom w:type="dxa" w:w="80"/>
-              <w:right w:type="dxa" w:w="120"/>
-            </w:tcMar>
-          </w:tcPr>
-          <w:p>
-            <w:pPr>
-              <w:spacing w:after="0" w:before="0"/>
-            </w:pPr>
-            <w:r>
-              <w:rPr>
-                <w:rFonts w:ascii="Arial" w:cs="Arial" w:eastAsia="Arial" w:hAnsi="Arial"/>
-                <w:sz w:val="21"/>
-                <w:szCs w:val="21"/>
-              </w:rPr>
-              <w:t xml:space="preserve"/>
-            </w:r>
-          </w:p>
-        </w:tc>
-        <w:tc>
-          <w:tcPr>
-            <w:tcW w:type="dxa" w:w="2410"/>
-            <w:tcBorders>
-              <w:top w:val="single" w:color="BFBFBF" w:sz="4"/>
-              <w:left w:val="single" w:color="BFBFBF" w:sz="4"/>
-              <w:bottom w:val="single" w:color="BFBFBF" w:sz="4"/>
-              <w:right w:val="single" w:color="BFBFBF" w:sz="4"/>
-            </w:tcBorders>
-            <w:tcMar>
-              <w:top w:type="dxa" w:w="80"/>
-              <w:left w:type="dxa" w:w="120"/>
-              <w:bottom w:type="dxa" w:w="80"/>
-              <w:right w:type="dxa" w:w="120"/>
-            </w:tcMar>
-          </w:tcPr>
-          <w:p>
-            <w:pPr>
-              <w:spacing w:after="0" w:before="0"/>
-            </w:pPr>
-            <w:r>
-              <w:rPr>
-                <w:rFonts w:ascii="Arial" w:cs="Arial" w:eastAsia="Arial" w:hAnsi="Arial"/>
-                <w:sz w:val="21"/>
-                <w:szCs w:val="21"/>
-              </w:rPr>
-              <w:t xml:space="preserve"/>
-            </w:r>
-          </w:p>
-        </w:tc>
-      </w:tr>
-    </w:tbl>
-    <w:p>
-      <w:pPr>
-        <w:keepNext/>
-        <w:spacing w:after="80" w:before="160"/>
-      </w:pPr>
-      <w:r>
-        <w:rPr>
-          <w:rFonts w:ascii="Arial" w:cs="Arial" w:eastAsia="Arial" w:hAnsi="Arial"/>
-          <w:b/>
-          <w:bCs/>
-          <w:caps/>
-          <w:color w:val="6F6F6F"/>
-          <w:spacing w:val="20"/>
-          <w:sz w:val="16"/>
-          <w:szCs w:val="16"/>
-        </w:rPr>
-        <w:t xml:space="preserve">Got more to say? Optional</w:t>
-      </w:r>
-    </w:p>
-    <w:tbl>
-      <w:tblPr>
-        <w:tblW w:type="dxa" w:w="9638"/>
-        <w:tblBorders>
-          <w:top w:val="single" w:color="auto" w:sz="4"/>
-          <w:left w:val="single" w:color="auto" w:sz="4"/>
-          <w:bottom w:val="single" w:color="auto" w:sz="4"/>
-          <w:right w:val="single" w:color="auto" w:sz="4"/>
-          <w:insideH w:val="single" w:color="auto" w:sz="4"/>
-          <w:insideV w:val="single" w:color="auto" w:sz="4"/>
-        </w:tblBorders>
-      </w:tblPr>
-      <w:tblGrid>
-        <w:gridCol w:w="3470"/>
-        <w:gridCol w:w="6168"/>
-      </w:tblGrid>
-      <w:tr>
-        <w:trPr>
-          <w:cantSplit/>
-          <w:trHeight w:val="700" w:hRule="atLeast"/>
-        </w:trPr>
-        <w:tc>
-          <w:tcPr>
-            <w:tcW w:type="dxa" w:w="3470"/>
-            <w:tcBorders>
-              <w:top w:val="single" w:color="BFBFBF" w:sz="4"/>
-              <w:left w:val="single" w:color="BFBFBF" w:sz="4"/>
-              <w:bottom w:val="single" w:color="BFBFBF" w:sz="4"/>
-              <w:right w:val="single" w:color="BFBFBF" w:sz="4"/>
-            </w:tcBorders>
-            <w:shd w:fill="F2F2F2" w:color="auto" w:val="clear"/>
-            <w:tcMar>
-              <w:top w:type="dxa" w:w="80"/>
-              <w:left w:type="dxa" w:w="120"/>
-              <w:bottom w:type="dxa" w:w="80"/>
-              <w:right w:type="dxa" w:w="120"/>
-            </w:tcMar>
-          </w:tcPr>
-          <w:p>
-            <w:pPr>
-              <w:spacing w:after="0" w:before="0"/>
-            </w:pPr>
-            <w:r>
-              <w:rPr>
-                <w:rFonts w:ascii="Arial" w:cs="Arial" w:eastAsia="Arial" w:hAnsi="Arial"/>
-                <w:color w:val="6F6F6F"/>
-                <w:sz w:val="18"/>
-                <w:szCs w:val="18"/>
-              </w:rPr>
-              <w:t xml:space="preserve">Health fund rebates, packages, memberships or gift cards?</w:t>
-            </w:r>
-          </w:p>
-        </w:tc>
-        <w:tc>
-          <w:tcPr>
-            <w:tcW w:type="dxa" w:w="6168"/>
-            <w:tcBorders>
-              <w:top w:val="single" w:color="BFBFBF" w:sz="4"/>
-              <w:left w:val="single" w:color="BFBFBF" w:sz="4"/>
-              <w:bottom w:val="single" w:color="BFBFBF" w:sz="4"/>
-              <w:right w:val="single" w:color="BFBFBF" w:sz="4"/>
-            </w:tcBorders>
-            <w:tcMar>
-              <w:top w:type="dxa" w:w="80"/>
-              <w:left w:type="dxa" w:w="120"/>
-              <w:bottom w:type="dxa" w:w="80"/>
-              <w:right w:type="dxa" w:w="120"/>
-            </w:tcMar>
-          </w:tcPr>
-          <w:p>
-            <w:pPr>
-              <w:spacing w:after="0" w:before="0"/>
-            </w:pPr>
-            <w:r>
-              <w:rPr>
-                <w:rFonts w:ascii="Arial" w:cs="Arial" w:eastAsia="Arial" w:hAnsi="Arial"/>
-                <w:sz w:val="21"/>
-                <w:szCs w:val="21"/>
-              </w:rPr>
-              <w:t xml:space="preserve"/>
-            </w:r>
-          </w:p>
-        </w:tc>
-      </w:tr>
-      <w:tr>
-        <w:trPr>
-          <w:cantSplit/>
-          <w:trHeight w:val="700" w:hRule="atLeast"/>
-        </w:trPr>
-        <w:tc>
-          <w:tcPr>
-            <w:tcW w:type="dxa" w:w="3470"/>
-            <w:tcBorders>
-              <w:top w:val="single" w:color="BFBFBF" w:sz="4"/>
-              <w:left w:val="single" w:color="BFBFBF" w:sz="4"/>
-              <w:bottom w:val="single" w:color="BFBFBF" w:sz="4"/>
-              <w:right w:val="single" w:color="BFBFBF" w:sz="4"/>
-            </w:tcBorders>
-            <w:shd w:fill="F2F2F2" w:color="auto" w:val="clear"/>
-            <w:tcMar>
-              <w:top w:type="dxa" w:w="80"/>
-              <w:left w:type="dxa" w:w="120"/>
-              <w:bottom w:type="dxa" w:w="80"/>
-              <w:right w:type="dxa" w:w="120"/>
-            </w:tcMar>
-          </w:tcPr>
-          <w:p>
-            <w:pPr>
-              <w:spacing w:after="0" w:before="0"/>
-            </w:pPr>
-            <w:r>
-              <w:rPr>
-                <w:rFonts w:ascii="Arial" w:cs="Arial" w:eastAsia="Arial" w:hAnsi="Arial"/>
-                <w:color w:val="6F6F6F"/>
-                <w:sz w:val="18"/>
-                <w:szCs w:val="18"/>
-              </w:rPr>
-              <w:t xml:space="preserve">Roughly what does a customer spend, and how often do they come back?</w:t>
-            </w:r>
-          </w:p>
-        </w:tc>
-        <w:tc>
-          <w:tcPr>
-            <w:tcW w:type="dxa" w:w="6168"/>
-            <w:tcBorders>
-              <w:top w:val="single" w:color="BFBFBF" w:sz="4"/>
-              <w:left w:val="single" w:color="BFBFBF" w:sz="4"/>
-              <w:bottom w:val="single" w:color="BFBFBF" w:sz="4"/>
-              <w:right w:val="single" w:color="BFBFBF" w:sz="4"/>
-            </w:tcBorders>
-            <w:tcMar>
-              <w:top w:type="dxa" w:w="80"/>
-              <w:left w:type="dxa" w:w="120"/>
-              <w:bottom w:type="dxa" w:w="80"/>
-              <w:right w:type="dxa" w:w="120"/>
-            </w:tcMar>
-          </w:tcPr>
-          <w:p>
-            <w:pPr>
-              <w:spacing w:after="0" w:before="0"/>
-            </w:pPr>
-            <w:r>
-              <w:rPr>
-                <w:rFonts w:ascii="Arial" w:cs="Arial" w:eastAsia="Arial" w:hAnsi="Arial"/>
-                <w:sz w:val="21"/>
-                <w:szCs w:val="21"/>
-              </w:rPr>
-              <w:t xml:space="preserve"/>
-            </w:r>
-          </w:p>
-        </w:tc>
-      </w:tr>
-    </w:tbl>
-    <w:p>
-      <w:pPr>
-        <w:keepNext/>
-        <w:spacing w:after="60" w:before="280"/>
-      </w:pPr>
-      <w:r>
-        <w:rPr>
-          <w:rFonts w:ascii="Arial" w:cs="Arial" w:eastAsia="Arial" w:hAnsi="Arial"/>
-          <w:b/>
-          <w:bCs/>
-          <w:sz w:val="22"/>
-          <w:szCs w:val="22"/>
-        </w:rPr>
-        <w:t xml:space="preserve">10.  </w:t>
-      </w:r>
-      <w:r>
-        <w:rPr>
-          <w:rFonts w:ascii="Arial" w:cs="Arial" w:eastAsia="Arial" w:hAnsi="Arial"/>
-          <w:b/>
-          <w:bCs/>
-          <w:sz w:val="22"/>
-          <w:szCs w:val="22"/>
-        </w:rPr>
-        <w:t xml:space="preserve">Any deals or specials coming up?</w:t>
-      </w:r>
-    </w:p>
-    <w:p>
-      <w:pPr>
-        <w:keepNext/>
-        <w:spacing w:after="80" w:before="0"/>
-      </w:pPr>
-      <w:r>
-        <w:rPr>
-          <w:rFonts w:ascii="Arial" w:cs="Arial" w:eastAsia="Arial" w:hAnsi="Arial"/>
-          <w:color w:val="6F6F6F"/>
-          <w:sz w:val="19"/>
-          <w:szCs w:val="19"/>
-        </w:rPr>
-        <w:t xml:space="preserve">Include the price, start and end dates, and any fine print. None right now? Just skip.</w:t>
+        <w:t xml:space="preserve">Which service would you love more people to book, and why?</w:t>
       </w:r>
     </w:p>
     <w:p>
@@ -3312,7 +3533,7 @@
           <w:sz w:val="18"/>
           <w:szCs w:val="18"/>
         </w:rPr>
-        <w:t xml:space="preserve">e.g. $20 off your first visit, 1 to 30 November, new clients only</w:t>
+        <w:t xml:space="preserve">e.g. Pregnancy massage. It's what we're best at and hardly anyone knows we do it.</w:t>
       </w:r>
     </w:p>
     <w:tbl>
@@ -3370,101 +3591,6 @@
     <w:p>
       <w:pPr>
         <w:keepNext/>
-        <w:spacing w:after="60" w:before="280"/>
-      </w:pPr>
-      <w:r>
-        <w:rPr>
-          <w:rFonts w:ascii="Arial" w:cs="Arial" w:eastAsia="Arial" w:hAnsi="Arial"/>
-          <w:b/>
-          <w:bCs/>
-          <w:sz w:val="22"/>
-          <w:szCs w:val="22"/>
-        </w:rPr>
-        <w:t xml:space="preserve">11.  </w:t>
-      </w:r>
-      <w:r>
-        <w:rPr>
-          <w:rFonts w:ascii="Arial" w:cs="Arial" w:eastAsia="Arial" w:hAnsi="Arial"/>
-          <w:b/>
-          <w:bCs/>
-          <w:sz w:val="22"/>
-          <w:szCs w:val="22"/>
-        </w:rPr>
-        <w:t xml:space="preserve">Which service would you love more people to book, and why?</w:t>
-      </w:r>
-    </w:p>
-    <w:p>
-      <w:pPr>
-        <w:keepNext/>
-        <w:spacing w:after="80" w:before="0"/>
-      </w:pPr>
-      <w:r>
-        <w:rPr>
-          <w:rFonts w:ascii="Arial" w:cs="Arial" w:eastAsia="Arial" w:hAnsi="Arial"/>
-          <w:i/>
-          <w:iCs/>
-          <w:color w:val="9A9A9A"/>
-          <w:sz w:val="18"/>
-          <w:szCs w:val="18"/>
-        </w:rPr>
-        <w:t xml:space="preserve">e.g. Pregnancy massage. It's what we're best at and hardly anyone knows we do it.</w:t>
-      </w:r>
-    </w:p>
-    <w:tbl>
-      <w:tblPr>
-        <w:tblW w:type="dxa" w:w="9638"/>
-        <w:tblBorders>
-          <w:top w:val="single" w:color="auto" w:sz="4"/>
-          <w:left w:val="single" w:color="auto" w:sz="4"/>
-          <w:bottom w:val="single" w:color="auto" w:sz="4"/>
-          <w:right w:val="single" w:color="auto" w:sz="4"/>
-          <w:insideH w:val="single" w:color="auto" w:sz="4"/>
-          <w:insideV w:val="single" w:color="auto" w:sz="4"/>
-        </w:tblBorders>
-      </w:tblPr>
-      <w:tblGrid>
-        <w:gridCol w:w="9638"/>
-      </w:tblGrid>
-      <w:tr>
-        <w:trPr>
-          <w:cantSplit/>
-          <w:trHeight w:val="1300" w:hRule="atLeast"/>
-        </w:trPr>
-        <w:tc>
-          <w:tcPr>
-            <w:tcW w:type="dxa" w:w="9638"/>
-            <w:tcBorders>
-              <w:top w:val="single" w:color="BFBFBF" w:sz="4"/>
-              <w:left w:val="single" w:color="BFBFBF" w:sz="4"/>
-              <w:bottom w:val="single" w:color="BFBFBF" w:sz="4"/>
-              <w:right w:val="single" w:color="BFBFBF" w:sz="4"/>
-            </w:tcBorders>
-            <w:tcMar>
-              <w:top w:type="dxa" w:w="80"/>
-              <w:left w:type="dxa" w:w="120"/>
-              <w:bottom w:type="dxa" w:w="80"/>
-              <w:right w:type="dxa" w:w="120"/>
-            </w:tcMar>
-          </w:tcPr>
-          <w:p>
-            <w:pPr>
-              <w:spacing w:after="0" w:before="0"/>
-            </w:pPr>
-            <w:r>
-              <w:rPr>
-                <w:rFonts w:ascii="Arial" w:cs="Arial" w:eastAsia="Arial" w:hAnsi="Arial"/>
-                <w:sz w:val="21"/>
-                <w:szCs w:val="21"/>
-              </w:rPr>
-              <w:t xml:space="preserve"/>
-            </w:r>
-          </w:p>
-        </w:tc>
-      </w:tr>
-    </w:tbl>
-    <w:p>
-      <w:pPr>
-        <w:keepNext/>
         <w:pBdr>
           <w:bottom w:val="single" w:color="111111" w:sz="12" w:space="6"/>
         </w:pBdr>
@@ -3503,7 +3629,7 @@
           <w:sz w:val="22"/>
           <w:szCs w:val="22"/>
         </w:rPr>
-        <w:t xml:space="preserve">12.  </w:t>
+        <w:t xml:space="preserve">13.  </w:t>
       </w:r>
       <w:r>
         <w:rPr>
@@ -4484,7 +4610,7 @@
           <w:sz w:val="22"/>
           <w:szCs w:val="22"/>
         </w:rPr>
-        <w:t xml:space="preserve">13.  </w:t>
+        <w:t xml:space="preserve">14.  </w:t>
       </w:r>
       <w:r>
         <w:rPr>
@@ -4746,7 +4872,7 @@
           <w:sz w:val="22"/>
           <w:szCs w:val="22"/>
         </w:rPr>
-        <w:t xml:space="preserve">14.  </w:t>
+        <w:t xml:space="preserve">15.  </w:t>
       </w:r>
       <w:r>
         <w:rPr>
@@ -5028,7 +5154,7 @@
           <w:sz w:val="22"/>
           <w:szCs w:val="22"/>
         </w:rPr>
-        <w:t xml:space="preserve">15.  </w:t>
+        <w:t xml:space="preserve">16.  </w:t>
       </w:r>
       <w:r>
         <w:rPr>
@@ -5166,7 +5292,7 @@
           <w:sz w:val="22"/>
           <w:szCs w:val="22"/>
         </w:rPr>
-        <w:t xml:space="preserve">16.  </w:t>
+        <w:t xml:space="preserve">17.  </w:t>
       </w:r>
       <w:r>
         <w:rPr>
@@ -5516,7 +5642,7 @@
           <w:sz w:val="22"/>
           <w:szCs w:val="22"/>
         </w:rPr>
-        <w:t xml:space="preserve">17.  </w:t>
+        <w:t xml:space="preserve">18.  </w:t>
       </w:r>
       <w:r>
         <w:rPr>
@@ -5726,7 +5852,7 @@
           <w:sz w:val="22"/>
           <w:szCs w:val="22"/>
         </w:rPr>
-        <w:t xml:space="preserve">18.  </w:t>
+        <w:t xml:space="preserve">19.  </w:t>
       </w:r>
       <w:r>
         <w:rPr>
@@ -5836,7 +5962,7 @@
           <w:sz w:val="22"/>
           <w:szCs w:val="22"/>
         </w:rPr>
-        <w:t xml:space="preserve">19.  </w:t>
+        <w:t xml:space="preserve">20.  </w:t>
       </w:r>
       <w:r>
         <w:rPr>
@@ -5946,7 +6072,7 @@
           <w:sz w:val="22"/>
           <w:szCs w:val="22"/>
         </w:rPr>
-        <w:t xml:space="preserve">20.  </w:t>
+        <w:t xml:space="preserve">21.  </w:t>
       </w:r>
       <w:r>
         <w:rPr>
@@ -6084,7 +6210,7 @@
           <w:sz w:val="22"/>
           <w:szCs w:val="22"/>
         </w:rPr>
-        <w:t xml:space="preserve">21.  </w:t>
+        <w:t xml:space="preserve">22.  </w:t>
       </w:r>
       <w:r>
         <w:rPr>
@@ -6924,7 +7050,7 @@
           <w:sz w:val="22"/>
           <w:szCs w:val="22"/>
         </w:rPr>
-        <w:t xml:space="preserve">22.  </w:t>
+        <w:t xml:space="preserve">23.  </w:t>
       </w:r>
       <w:r>
         <w:rPr>
@@ -7138,7 +7264,7 @@
           <w:sz w:val="22"/>
           <w:szCs w:val="22"/>
         </w:rPr>
-        <w:t xml:space="preserve">23.  </w:t>
+        <w:t xml:space="preserve">24.  </w:t>
       </w:r>
       <w:r>
         <w:rPr>
@@ -7380,7 +7506,7 @@
           <w:sz w:val="22"/>
           <w:szCs w:val="22"/>
         </w:rPr>
-        <w:t xml:space="preserve">24.  </w:t>
+        <w:t xml:space="preserve">25.  </w:t>
       </w:r>
       <w:r>
         <w:rPr>
@@ -7490,7 +7616,7 @@
           <w:sz w:val="22"/>
           <w:szCs w:val="22"/>
         </w:rPr>
-        <w:t xml:space="preserve">25.  </w:t>
+        <w:t xml:space="preserve">26.  </w:t>
       </w:r>
       <w:r>
         <w:rPr>
@@ -7689,7 +7815,7 @@
           <w:sz w:val="22"/>
           <w:szCs w:val="22"/>
         </w:rPr>
-        <w:t xml:space="preserve">26.  </w:t>
+        <w:t xml:space="preserve">27.  </w:t>
       </w:r>
       <w:r>
         <w:rPr>
@@ -7903,7 +8029,7 @@
           <w:sz w:val="22"/>
           <w:szCs w:val="22"/>
         </w:rPr>
-        <w:t xml:space="preserve">27.  </w:t>
+        <w:t xml:space="preserve">28.  </w:t>
       </w:r>
       <w:r>
         <w:rPr>
@@ -8130,7 +8256,7 @@
           <w:sz w:val="22"/>
           <w:szCs w:val="22"/>
         </w:rPr>
-        <w:t xml:space="preserve">28.  </w:t>
+        <w:t xml:space="preserve">29.  </w:t>
       </w:r>
       <w:r>
         <w:rPr>
@@ -8508,7 +8634,7 @@
           <w:sz w:val="22"/>
           <w:szCs w:val="22"/>
         </w:rPr>
-        <w:t xml:space="preserve">29.  </w:t>
+        <w:t xml:space="preserve">30.  </w:t>
       </w:r>
       <w:r>
         <w:rPr>
@@ -8722,7 +8848,7 @@
           <w:sz w:val="22"/>
           <w:szCs w:val="22"/>
         </w:rPr>
-        <w:t xml:space="preserve">30.  </w:t>
+        <w:t xml:space="preserve">31.  </w:t>
       </w:r>
       <w:r>
         <w:rPr>
@@ -9106,7 +9232,7 @@
           <w:sz w:val="22"/>
           <w:szCs w:val="22"/>
         </w:rPr>
-        <w:t xml:space="preserve">31.  </w:t>
+        <w:t xml:space="preserve">32.  </w:t>
       </w:r>
       <w:r>
         <w:rPr>
@@ -9133,7 +9259,7 @@
           <w:sz w:val="18"/>
           <w:szCs w:val="18"/>
         </w:rPr>
-        <w:t xml:space="preserve">Only if you picked “Custom Retainer” in question 1.</w:t>
+        <w:t xml:space="preserve">Only if you picked “Custom Retainer” in question 7.</w:t>
       </w:r>
     </w:p>
     <w:p>
@@ -9403,7 +9529,7 @@
           <w:sz w:val="22"/>
           <w:szCs w:val="22"/>
         </w:rPr>
-        <w:t xml:space="preserve">32.  </w:t>
+        <w:t xml:space="preserve">33.  </w:t>
       </w:r>
       <w:r>
         <w:rPr>
@@ -9753,7 +9879,7 @@
           <w:sz w:val="22"/>
           <w:szCs w:val="22"/>
         </w:rPr>
-        <w:t xml:space="preserve">33.  </w:t>
+        <w:t xml:space="preserve">34.  </w:t>
       </w:r>
       <w:r>
         <w:rPr>

</xml_diff>